<commit_message>
Agreement generator template seems about done
</commit_message>
<xml_diff>
--- a/templates/agreement_template.docx
+++ b/templates/agreement_template.docx
@@ -65,7 +65,7 @@
           <w:rFonts w:ascii="Faruma" w:hAnsi="Faruma" w:cs="Faruma"/>
           <w:sz w:val="28"/>
           <w:szCs w:val="28"/>
-          <w:rtl/>
+          <w:lang w:bidi="dv-MV"/>
         </w:rPr>
       </w:pPr>
       <w:r>
@@ -75,27 +75,58 @@
           <w:szCs w:val="28"/>
           <w:rtl/>
         </w:rPr>
-        <w:t>މިއީ، މއ. އަސްޓްރަލް ބަހައިގެން ގ. ހިޔާ އަތިއްޔާ އަލީ އަށް ލިބުނު ބައިގައި ކޮށްފަހުރި އިމާރާތުގެ ފްލޯނަންބަރު</w:t>
-      </w:r>
-    </w:p>
-    <w:p>
-      <w:pPr>
-        <w:ind w:left="720" w:right="110"/>
-        <w:jc w:val="center"/>
-        <w:rPr>
-          <w:rFonts w:ascii="Faruma" w:hAnsi="Faruma" w:cs="MV Boli"/>
+        <w:t xml:space="preserve">މިއީ، މއ. އަސްޓްރަލް ބަހައިގެން ގ. ހިޔާ އަތިއްޔާ އަލީ އަށް ލިބުނު ބައިގައި ކޮށްފަހުރި އިމާރާތުގެ </w:t>
+      </w:r>
+      <w:r>
+        <w:rPr>
+          <w:rFonts w:ascii="Faruma" w:hAnsi="Faruma" w:cs="Faruma" w:hint="cs"/>
+          <w:color w:val="EE0000"/>
           <w:sz w:val="28"/>
           <w:szCs w:val="28"/>
-        </w:rPr>
-      </w:pPr>
+          <w:rtl/>
+          <w:lang w:bidi="dv-MV"/>
+        </w:rPr>
+        <w:t>ފްލޯނަންބަރު</w:t>
+      </w:r>
       <w:r>
         <w:rPr>
           <w:rFonts w:ascii="Faruma" w:hAnsi="Faruma" w:cs="Faruma" w:hint="cs"/>
           <w:sz w:val="28"/>
           <w:szCs w:val="28"/>
           <w:rtl/>
-        </w:rPr>
-        <w:t>ޓެނަންޓްމައުލޫމާތު އަށް ކުއްޔަށް (އެއް ރޫމް އެޕާޓްމަންތް ފްލެޓް) ދިނުމަށްކުރި އެގްރިމަންޓްއެކެވެ.</w:t>
+          <w:lang w:bidi="dv-MV"/>
+        </w:rPr>
+        <w:t>ބުރި</w:t>
+      </w:r>
+      <w:r>
+        <w:rPr>
+          <w:rFonts w:ascii="Faruma" w:hAnsi="Faruma" w:cs="Faruma" w:hint="cs"/>
+          <w:sz w:val="28"/>
+          <w:szCs w:val="28"/>
+          <w:rtl/>
+          <w:lang w:bidi="dv-MV"/>
+        </w:rPr>
+        <w:t xml:space="preserve"> </w:t>
+      </w:r>
+      <w:r>
+        <w:rPr>
+          <w:rFonts w:ascii="Faruma" w:hAnsi="Faruma" w:cs="Faruma" w:hint="cs"/>
+          <w:color w:val="EE0000"/>
+          <w:sz w:val="28"/>
+          <w:szCs w:val="28"/>
+          <w:rtl/>
+          <w:lang w:bidi="dv-MV"/>
+        </w:rPr>
+        <w:t>ޓެނަންޓްމައުލޫމާތު</w:t>
+      </w:r>
+      <w:r>
+        <w:rPr>
+          <w:rFonts w:ascii="Faruma" w:hAnsi="Faruma" w:cs="Faruma" w:hint="cs"/>
+          <w:sz w:val="28"/>
+          <w:szCs w:val="28"/>
+          <w:rtl/>
+        </w:rPr>
+        <w:t xml:space="preserve"> އަށް ކުއްޔަށް (އެއް ރޫމް އެޕާޓްމަންތް ފްލެޓް) ދިނުމަށްކުރި އެގްރިމަންޓްއެކެވެ.</w:t>
       </w:r>
     </w:p>
     <w:p>
@@ -224,6 +255,7 @@
       <w:r>
         <w:rPr>
           <w:rFonts w:ascii="Faruma" w:hAnsi="Faruma" w:cs="Faruma" w:hint="cs"/>
+          <w:color w:val="EE0000"/>
           <w:rtl/>
           <w:lang w:bidi="dv-MV"/>
         </w:rPr>
@@ -235,6 +267,14 @@
           <w:rtl/>
           <w:lang w:bidi="dv-MV"/>
         </w:rPr>
+        <w:t>ބުރި</w:t>
+      </w:r>
+      <w:r>
+        <w:rPr>
+          <w:rFonts w:ascii="Faruma" w:hAnsi="Faruma" w:cs="Faruma" w:hint="cs"/>
+          <w:rtl/>
+          <w:lang w:bidi="dv-MV"/>
+        </w:rPr>
         <w:t>"</w:t>
       </w:r>
       <w:r>
@@ -284,14 +324,23 @@
           <w:rFonts w:ascii="Faruma" w:hAnsi="Faruma" w:cs="Faruma"/>
           <w:rtl/>
         </w:rPr>
-        <w:t>ޢިމާރާތުގެ ދެ</w:t>
-      </w:r>
-      <w:r>
-        <w:rPr>
-          <w:rFonts w:ascii="Faruma" w:hAnsi="Faruma" w:cs="Faruma"/>
-          <w:rtl/>
-        </w:rPr>
-        <w:t>ވަނަބުރި (އެއްރޫމް އެޕާޓްމަންޓް ފްލެޓް) އަށެވެ. އަދި "ވެރިފަރާތް" އޭ</w:t>
+        <w:t xml:space="preserve">ޢިމާރާތުގެ </w:t>
+      </w:r>
+      <w:r>
+        <w:rPr>
+          <w:rFonts w:ascii="Faruma" w:hAnsi="Faruma" w:cs="Faruma"/>
+          <w:color w:val="EE0000"/>
+          <w:rtl/>
+          <w:lang w:bidi="dv-MV"/>
+        </w:rPr>
+        <w:t>ފްލޯނަންބަރު</w:t>
+      </w:r>
+      <w:r>
+        <w:rPr>
+          <w:rFonts w:ascii="Faruma" w:hAnsi="Faruma" w:cs="Faruma"/>
+          <w:rtl/>
+        </w:rPr>
+        <w:t>ބުރި (އެއްރޫމް އެޕާޓްމަންޓް ފްލެޓް) އަށެވެ. އަދި "ވެރިފަރާތް" އޭ</w:t>
       </w:r>
       <w:r>
         <w:rPr>
@@ -320,7 +369,24 @@
           <w:rtl/>
           <w:lang w:bidi="dv-MV"/>
         </w:rPr>
-        <w:t xml:space="preserve"> ޓެނަންޓްމައުލޫމާތު </w:t>
+        <w:t xml:space="preserve"> </w:t>
+      </w:r>
+      <w:r>
+        <w:rPr>
+          <w:rFonts w:ascii="Faruma" w:hAnsi="Faruma" w:cs="Faruma" w:hint="cs"/>
+          <w:color w:val="EE0000"/>
+          <w:rtl/>
+          <w:lang w:bidi="dv-MV"/>
+        </w:rPr>
+        <w:t>ޓެނަންޓްމައުލޫމާތު</w:t>
+      </w:r>
+      <w:r>
+        <w:rPr>
+          <w:rFonts w:ascii="Faruma" w:hAnsi="Faruma" w:cs="Faruma" w:hint="cs"/>
+          <w:rtl/>
+          <w:lang w:bidi="dv-MV"/>
+        </w:rPr>
+        <w:t xml:space="preserve"> </w:t>
       </w:r>
       <w:r>
         <w:rPr>
@@ -400,9 +466,11 @@
       <w:r>
         <w:rPr>
           <w:rFonts w:ascii="Faruma" w:hAnsi="Faruma" w:cs="Faruma" w:hint="cs"/>
-          <w:rtl/>
-        </w:rPr>
-        <w:t>ދެވަނަ</w:t>
+          <w:color w:val="EE0000"/>
+          <w:rtl/>
+          <w:lang w:bidi="dv-MV"/>
+        </w:rPr>
+        <w:t>ފްލޯނަންބަރު</w:t>
       </w:r>
       <w:r>
         <w:rPr>
@@ -435,9 +503,11 @@
       <w:r>
         <w:rPr>
           <w:rFonts w:ascii="Faruma" w:hAnsi="Faruma" w:cs="Faruma" w:hint="cs"/>
-          <w:rtl/>
-        </w:rPr>
-        <w:t>06 މެއި 2026</w:t>
+          <w:color w:val="EE0000"/>
+          <w:rtl/>
+          <w:lang w:bidi="dv-MV"/>
+        </w:rPr>
+        <w:t>އެގްރީމަންޓްފެށޭތާރީހް</w:t>
       </w:r>
       <w:r>
         <w:rPr>
@@ -456,9 +526,18 @@
       <w:r>
         <w:rPr>
           <w:rFonts w:ascii="Faruma" w:hAnsi="Faruma" w:cs="Faruma" w:hint="cs"/>
-          <w:rtl/>
-        </w:rPr>
-        <w:t xml:space="preserve">30 އޭޕްރިލް 2028 </w:t>
+          <w:color w:val="EE0000"/>
+          <w:rtl/>
+          <w:lang w:bidi="dv-MV"/>
+        </w:rPr>
+        <w:t>އެގްރީމަންޓްނިމޭތާރީހް</w:t>
+      </w:r>
+      <w:r>
+        <w:rPr>
+          <w:rFonts w:ascii="Faruma" w:hAnsi="Faruma" w:cs="Faruma" w:hint="cs"/>
+          <w:rtl/>
+        </w:rPr>
+        <w:t xml:space="preserve"> </w:t>
       </w:r>
       <w:r>
         <w:rPr>
@@ -478,8 +557,18 @@
         <w:rPr>
           <w:rFonts w:ascii="Faruma" w:hAnsi="Faruma" w:cs="Faruma" w:hint="cs"/>
           <w:rtl/>
-        </w:rPr>
-        <w:t xml:space="preserve"> 2</w:t>
+          <w:lang w:bidi="dv-MV"/>
+        </w:rPr>
+        <w:t xml:space="preserve"> </w:t>
+      </w:r>
+      <w:r>
+        <w:rPr>
+          <w:rFonts w:ascii="Faruma" w:hAnsi="Faruma" w:cs="Faruma" w:hint="cs"/>
+          <w:color w:val="EE0000"/>
+          <w:rtl/>
+          <w:lang w:bidi="dv-MV"/>
+        </w:rPr>
+        <w:t>އެގްރީމަންޓްމުއްދަތު</w:t>
       </w:r>
       <w:r>
         <w:rPr>
@@ -531,9 +620,11 @@
       <w:r>
         <w:rPr>
           <w:rFonts w:ascii="Faruma" w:hAnsi="Faruma" w:cs="Faruma" w:hint="cs"/>
-          <w:rtl/>
-        </w:rPr>
-        <w:t>ދެވަނަ</w:t>
+          <w:color w:val="EE0000"/>
+          <w:rtl/>
+          <w:lang w:bidi="dv-MV"/>
+        </w:rPr>
+        <w:t>ފްލޯނަންބަރު</w:t>
       </w:r>
       <w:r>
         <w:rPr>
@@ -554,49 +645,31 @@
           <w:rFonts w:ascii="Faruma" w:hAnsi="Faruma" w:cs="Faruma"/>
           <w:rtl/>
         </w:rPr>
-        <w:t>ިނީ، ކޮންމެ މީލާދީމަހަކު -/</w:t>
-      </w:r>
-      <w:r>
-        <w:rPr>
-          <w:rFonts w:ascii="Faruma" w:hAnsi="Faruma" w:cs="Faruma" w:hint="cs"/>
-          <w:rtl/>
-        </w:rPr>
-        <w:t xml:space="preserve">10،000 </w:t>
-      </w:r>
-      <w:r>
-        <w:rPr>
-          <w:rFonts w:ascii="Faruma" w:hAnsi="Faruma" w:cs="Faruma"/>
-          <w:rtl/>
-        </w:rPr>
-        <w:t>(</w:t>
-      </w:r>
-      <w:r>
-        <w:rPr>
-          <w:rFonts w:ascii="Faruma" w:hAnsi="Faruma" w:cs="Faruma" w:hint="cs"/>
-          <w:rtl/>
-        </w:rPr>
-        <w:t>ދިހަ</w:t>
-      </w:r>
-      <w:r>
-        <w:rPr>
-          <w:rFonts w:ascii="Faruma" w:hAnsi="Faruma" w:cs="Faruma"/>
-          <w:rtl/>
-        </w:rPr>
-        <w:t>ހާސް</w:t>
-      </w:r>
-      <w:r>
-        <w:rPr>
-          <w:rFonts w:ascii="Faruma" w:hAnsi="Faruma" w:cs="Faruma"/>
-          <w:rtl/>
-        </w:rPr>
-        <w:t xml:space="preserve"> ދިވެހި ރުފިޔާ)</w:t>
-      </w:r>
-      <w:r>
-        <w:rPr>
-          <w:rFonts w:ascii="Faruma" w:hAnsi="Faruma" w:cs="Faruma"/>
-          <w:rtl/>
-        </w:rPr>
-        <w:t xml:space="preserve"> ގެ މަ</w:t>
+        <w:t xml:space="preserve">ިނީ، ކޮންމެ މީލާދީމަހަކު </w:t>
+      </w:r>
+      <w:r>
+        <w:rPr>
+          <w:rFonts w:ascii="Faruma" w:hAnsi="Faruma" w:cs="Faruma" w:hint="cs"/>
+          <w:color w:val="EE0000"/>
+          <w:rtl/>
+          <w:lang w:bidi="dv-MV"/>
+        </w:rPr>
+        <w:t>ރެންޓްއެމައުންޓް</w:t>
+      </w:r>
+      <w:r>
+        <w:rPr>
+          <w:rFonts w:ascii="Faruma" w:hAnsi="Faruma" w:cs="Faruma" w:hint="cs"/>
+          <w:rtl/>
+          <w:lang w:bidi="dv-MV"/>
+        </w:rPr>
+        <w:t xml:space="preserve"> </w:t>
+      </w:r>
+      <w:r>
+        <w:rPr>
+          <w:rFonts w:ascii="Faruma" w:hAnsi="Faruma" w:cs="Faruma"/>
+          <w:rtl/>
+        </w:rPr>
+        <w:t>ގެ މަ</w:t>
       </w:r>
       <w:r>
         <w:rPr>
@@ -648,7 +721,31 @@
           <w:rFonts w:ascii="Faruma" w:hAnsi="Faruma" w:cs="Faruma" w:hint="cs"/>
           <w:rtl/>
         </w:rPr>
-        <w:t xml:space="preserve"> ސޮއިކުރާއިރު ސެކިއުރިޓީ ފައިސާގެގޮތުގައި -/10،000 (ދިހަހާސް ރުފިޔާ) ވެރިފަރާތ</w:t>
+        <w:t xml:space="preserve"> ސޮއިކުރާއިރު ސެކިއުރިޓީ ފައިސާގެގޮތުގައި </w:t>
+      </w:r>
+      <w:r>
+        <w:rPr>
+          <w:rFonts w:ascii="Faruma" w:hAnsi="Faruma" w:cs="Faruma" w:hint="cs"/>
+          <w:color w:val="EE0000"/>
+          <w:rtl/>
+          <w:lang w:bidi="dv-MV"/>
+        </w:rPr>
+        <w:t>ވަންޑިޕޮސިޓް</w:t>
+      </w:r>
+      <w:r>
+        <w:rPr>
+          <w:rFonts w:ascii="Faruma" w:hAnsi="Faruma" w:cs="Faruma" w:hint="cs"/>
+          <w:rtl/>
+          <w:lang w:bidi="dv-MV"/>
+        </w:rPr>
+        <w:t xml:space="preserve"> </w:t>
+      </w:r>
+      <w:r>
+        <w:rPr>
+          <w:rFonts w:ascii="Faruma" w:hAnsi="Faruma" w:cs="Faruma" w:hint="cs"/>
+          <w:rtl/>
+        </w:rPr>
+        <w:t>ވެރިފަރާތ</w:t>
       </w:r>
       <w:r>
         <w:rPr>
@@ -838,21 +935,39 @@
           <w:rFonts w:ascii="Faruma" w:hAnsi="Faruma" w:cs="Faruma"/>
           <w:rtl/>
         </w:rPr>
-        <w:t xml:space="preserve">ކުއްޔަށްހިފި ފަރާތުން </w:t>
-      </w:r>
-      <w:r>
-        <w:rPr>
-          <w:rFonts w:ascii="Faruma" w:hAnsi="Faruma" w:cs="Faruma" w:hint="cs"/>
-          <w:rtl/>
-        </w:rPr>
-        <w:t>ދެވަނަ</w:t>
-      </w:r>
-      <w:r>
-        <w:rPr>
-          <w:rFonts w:ascii="Faruma" w:hAnsi="Faruma" w:cs="Faruma"/>
-          <w:rtl/>
-        </w:rPr>
-        <w:t>ބުރި ކުއްޔަށްހިފި މުއްދަތުގެ ތެރޭގައި، އެބުރީގައި ބޭނުންކުރާ ކަރަންޓް ބިލ</w:t>
+        <w:t>ކުއްޔަށްހިފި ފަރާތުން</w:t>
+      </w:r>
+      <w:r>
+        <w:rPr>
+          <w:rFonts w:ascii="Faruma" w:hAnsi="Faruma" w:cs="Faruma" w:hint="cs"/>
+          <w:rtl/>
+          <w:lang w:bidi="dv-MV"/>
+        </w:rPr>
+        <w:t xml:space="preserve"> </w:t>
+      </w:r>
+      <w:r>
+        <w:rPr>
+          <w:rFonts w:ascii="Faruma" w:hAnsi="Faruma" w:cs="Faruma" w:hint="cs"/>
+          <w:color w:val="EE0000"/>
+          <w:rtl/>
+          <w:lang w:bidi="dv-MV"/>
+        </w:rPr>
+        <w:t>ފްލޯނަންބަރު</w:t>
+      </w:r>
+      <w:r>
+        <w:rPr>
+          <w:rFonts w:ascii="Faruma" w:hAnsi="Faruma" w:cs="Faruma" w:hint="cs"/>
+          <w:rtl/>
+          <w:lang w:bidi="dv-MV"/>
+        </w:rPr>
+        <w:t>ބުރި</w:t>
+      </w:r>
+      <w:r>
+        <w:rPr>
+          <w:rFonts w:ascii="Faruma" w:hAnsi="Faruma" w:cs="Faruma"/>
+          <w:rtl/>
+        </w:rPr>
+        <w:t xml:space="preserve"> ކުއްޔަށްހިފި މުއްދަތުގެ ތެރޭގައި، އެބުރީގައި ބޭނުންކުރާ ކަރަންޓް ބިލ</w:t>
       </w:r>
       <w:r>
         <w:rPr>
@@ -913,9 +1028,11 @@
       <w:r>
         <w:rPr>
           <w:rFonts w:ascii="Faruma" w:hAnsi="Faruma" w:cs="Faruma" w:hint="cs"/>
-          <w:rtl/>
-        </w:rPr>
-        <w:t>ދެވަނަ</w:t>
+          <w:color w:val="EE0000"/>
+          <w:rtl/>
+          <w:lang w:bidi="dv-MV"/>
+        </w:rPr>
+        <w:t>ފްލޯނަންބަރު</w:t>
       </w:r>
       <w:r>
         <w:rPr>
@@ -990,16 +1107,26 @@
       <w:r>
         <w:rPr>
           <w:rFonts w:ascii="Faruma" w:hAnsi="Faruma" w:cs="Faruma" w:hint="cs"/>
-          <w:rtl/>
-        </w:rPr>
-        <w:t>ދެވަނަ</w:t>
-      </w:r>
-      <w:r>
-        <w:rPr>
-          <w:rFonts w:ascii="Faruma" w:hAnsi="Faruma" w:cs="Faruma"/>
-          <w:rtl/>
-        </w:rPr>
-        <w:t>ބުރީގެ އެތެރެއަށް ވެރިފަރާތް ނުވަތަ އެކަމ</w:t>
+          <w:color w:val="EE0000"/>
+          <w:rtl/>
+          <w:lang w:bidi="dv-MV"/>
+        </w:rPr>
+        <w:t>ފްލޯނަންބަރު</w:t>
+      </w:r>
+      <w:r>
+        <w:rPr>
+          <w:rFonts w:ascii="Faruma" w:hAnsi="Faruma" w:cs="Faruma" w:hint="cs"/>
+          <w:rtl/>
+          <w:lang w:bidi="dv-MV"/>
+        </w:rPr>
+        <w:t>ބުރި</w:t>
+      </w:r>
+      <w:r>
+        <w:rPr>
+          <w:rFonts w:ascii="Faruma" w:hAnsi="Faruma" w:cs="Faruma"/>
+          <w:rtl/>
+        </w:rPr>
+        <w:t xml:space="preserve"> އެތެރެއަށް ވެރިފަރާތް ނުވަތަ އެކަމ</w:t>
       </w:r>
       <w:r>
         <w:rPr>
@@ -1027,1175 +1154,1189 @@
           <w:rFonts w:ascii="Faruma" w:hAnsi="Faruma" w:cs="Faruma"/>
           <w:rtl/>
         </w:rPr>
-        <w:t xml:space="preserve">މިގޮތުން </w:t>
-      </w:r>
-      <w:r>
-        <w:rPr>
-          <w:rFonts w:ascii="Faruma" w:hAnsi="Faruma" w:cs="Faruma"/>
+        <w:t xml:space="preserve">މިގޮތުން ބަލާބެލުމުގައި، </w:t>
+      </w:r>
+      <w:r>
+        <w:rPr>
+          <w:rFonts w:ascii="Faruma" w:hAnsi="Faruma" w:cs="Faruma" w:hint="cs"/>
+          <w:color w:val="EE0000"/>
+          <w:rtl/>
+          <w:lang w:bidi="dv-MV"/>
+        </w:rPr>
+        <w:t>ފްލޯނަންބަރު</w:t>
+      </w:r>
+      <w:r>
+        <w:rPr>
+          <w:rFonts w:ascii="Faruma" w:hAnsi="Faruma" w:cs="Faruma" w:hint="cs"/>
+          <w:rtl/>
+          <w:lang w:bidi="dv-MV"/>
+        </w:rPr>
+        <w:t>ބުރި</w:t>
+      </w:r>
+      <w:r>
+        <w:rPr>
+          <w:rFonts w:ascii="Faruma" w:hAnsi="Faruma" w:cs="Faruma"/>
+          <w:rtl/>
+        </w:rPr>
+        <w:t xml:space="preserve"> ސާފުތާހިރުކަން ނެތުމުގެ ސަބަބުން ޢިމާރާތައް ގެއްލުމެއް ލިބިދާނެކަމަށް ވެރިފަރާތް ފާހަގަކުރާ ކަންކަތައް ކުއްޔަށްހިފި ފަރާތުން</w:t>
+      </w:r>
+      <w:r>
+        <w:rPr>
+          <w:rFonts w:ascii="Faruma" w:hAnsi="Faruma" w:cs="Faruma"/>
+          <w:rtl/>
+        </w:rPr>
+        <w:t xml:space="preserve"> ރަނގަޅުކޮން އިޞްލާހު ކުރަންވާނެއެވެ.</w:t>
+      </w:r>
+    </w:p>
+    <w:p>
+      <w:pPr>
+        <w:pStyle w:val="ListParagraph"/>
+        <w:spacing w:after="0"/>
+        <w:ind w:right="440" w:firstLine="360"/>
+        <w:jc w:val="right"/>
+        <w:rPr>
+          <w:rFonts w:ascii="Faruma" w:hAnsi="Faruma" w:cs="Faruma"/>
+          <w:rtl/>
+        </w:rPr>
+      </w:pPr>
+    </w:p>
+    <w:p>
+      <w:pPr>
+        <w:pStyle w:val="ListParagraph"/>
+        <w:spacing w:after="0"/>
+        <w:ind w:right="440" w:firstLine="360"/>
+        <w:jc w:val="right"/>
+        <w:rPr>
+          <w:rFonts w:ascii="Faruma" w:hAnsi="Faruma" w:cs="Faruma"/>
+          <w:rtl/>
+        </w:rPr>
+      </w:pPr>
+      <w:r>
+        <w:rPr>
+          <w:rFonts w:ascii="Faruma" w:hAnsi="Faruma" w:cs="Faruma" w:hint="cs"/>
+          <w:b/>
+          <w:bCs/>
+          <w:rtl/>
+        </w:rPr>
+        <w:t>9</w:t>
+      </w:r>
+      <w:r>
+        <w:rPr>
+          <w:rFonts w:ascii="Faruma" w:hAnsi="Faruma" w:cs="Faruma" w:hint="cs"/>
+          <w:b/>
+          <w:bCs/>
+          <w:rtl/>
+        </w:rPr>
+        <w:t xml:space="preserve">- </w:t>
+      </w:r>
+      <w:r>
+        <w:rPr>
+          <w:rFonts w:ascii="Faruma" w:hAnsi="Faruma" w:cs="Faruma"/>
+          <w:rtl/>
+        </w:rPr>
+        <w:t>ޢިމާރާތުގެ ރ</w:t>
+      </w:r>
+      <w:r>
+        <w:rPr>
+          <w:rFonts w:ascii="Faruma" w:hAnsi="Faruma" w:cs="Faruma"/>
+          <w:rtl/>
+        </w:rPr>
+        <w:t>ަ</w:t>
+      </w:r>
+      <w:r>
+        <w:rPr>
+          <w:rFonts w:ascii="Faruma" w:hAnsi="Faruma" w:cs="Faruma"/>
+          <w:rtl/>
+        </w:rPr>
+        <w:t>އްކަލަށްޓަކައި، ޢިމާރާތުގެ އެއްވެސް ތަނެއް ތޮރުފާ އަދި މޮހޮރު ޖަހާ ހަދަންވާނީ ވެރިފަރާތަށް އެކަން އެނގުމަށްފަހު، ވެރިފަރާތުން އެކަމަށް ހުއްދ</w:t>
+      </w:r>
+      <w:r>
+        <w:rPr>
+          <w:rFonts w:ascii="Faruma" w:hAnsi="Faruma" w:cs="Faruma"/>
+          <w:rtl/>
+        </w:rPr>
+        <w:t xml:space="preserve">ަލިބިގެން، </w:t>
+      </w:r>
+      <w:r>
+        <w:rPr>
+          <w:rFonts w:ascii="Faruma" w:hAnsi="Faruma" w:cs="Faruma"/>
+          <w:rtl/>
+        </w:rPr>
+        <w:t>ވެރިފަރާތުން އެކަންކުރަން</w:t>
+      </w:r>
+      <w:r>
+        <w:rPr>
+          <w:rFonts w:ascii="Faruma" w:hAnsi="Faruma" w:cs="Faruma"/>
+          <w:rtl/>
+        </w:rPr>
+        <w:t xml:space="preserve"> އަންގާގޮތަކަށެވެ.</w:t>
+      </w:r>
+    </w:p>
+    <w:p>
+      <w:pPr>
+        <w:pStyle w:val="ListParagraph"/>
+        <w:spacing w:after="0"/>
+        <w:ind w:right="440" w:firstLine="360"/>
+        <w:jc w:val="right"/>
+        <w:rPr>
+          <w:rFonts w:ascii="Faruma" w:hAnsi="Faruma" w:cs="Faruma"/>
+          <w:rtl/>
+        </w:rPr>
+      </w:pPr>
+    </w:p>
+    <w:p>
+      <w:pPr>
+        <w:pStyle w:val="ListParagraph"/>
+        <w:spacing w:after="0"/>
+        <w:ind w:right="440" w:firstLine="360"/>
+        <w:jc w:val="right"/>
+        <w:rPr>
+          <w:rFonts w:ascii="Faruma" w:hAnsi="Faruma" w:cs="Faruma"/>
+          <w:rtl/>
+        </w:rPr>
+      </w:pPr>
+      <w:r>
+        <w:rPr>
+          <w:rFonts w:ascii="Faruma" w:hAnsi="Faruma" w:cs="Faruma" w:hint="cs"/>
+          <w:b/>
+          <w:bCs/>
+          <w:rtl/>
+        </w:rPr>
+        <w:t>10</w:t>
+      </w:r>
+      <w:r>
+        <w:rPr>
+          <w:rFonts w:ascii="Faruma" w:hAnsi="Faruma" w:cs="Faruma"/>
+          <w:b/>
+          <w:bCs/>
+          <w:rtl/>
+        </w:rPr>
+        <w:t>-</w:t>
+      </w:r>
+      <w:r>
+        <w:rPr>
+          <w:rFonts w:ascii="Faruma" w:hAnsi="Faruma" w:cs="Faruma"/>
+          <w:b/>
+          <w:bCs/>
+          <w:rtl/>
+        </w:rPr>
+        <w:t xml:space="preserve"> </w:t>
+      </w:r>
+      <w:r>
+        <w:rPr>
+          <w:rFonts w:ascii="Faruma" w:hAnsi="Faruma" w:cs="Faruma" w:hint="cs"/>
+          <w:color w:val="EE0000"/>
+          <w:rtl/>
+          <w:lang w:bidi="dv-MV"/>
+        </w:rPr>
+        <w:t>ފްލޯނަންބަރު</w:t>
+      </w:r>
+      <w:r>
+        <w:rPr>
+          <w:rFonts w:ascii="Faruma" w:hAnsi="Faruma" w:cs="Faruma" w:hint="cs"/>
+          <w:rtl/>
+          <w:lang w:bidi="dv-MV"/>
+        </w:rPr>
+        <w:t>ބުރީގައި</w:t>
+      </w:r>
+      <w:r>
+        <w:rPr>
+          <w:rFonts w:ascii="Faruma" w:hAnsi="Faruma" w:cs="Faruma"/>
+          <w:rtl/>
+        </w:rPr>
+        <w:t xml:space="preserve"> (އެޕާޓްމަންޓްގައި) ހަރުކޮއްފައިހުރި އެއްވެސް އެއްޗަކައް އެއްވެސް ބާވަތެއްގެ ގެއްލުމެއް ލިބިއްޖެނަމަ ލ</w:t>
+      </w:r>
+      <w:r>
+        <w:rPr>
+          <w:rFonts w:ascii="Faruma" w:hAnsi="Faruma" w:cs="Faruma"/>
+          <w:rtl/>
+        </w:rPr>
+        <w:t>ަ</w:t>
+      </w:r>
+      <w:r>
+        <w:rPr>
+          <w:rFonts w:ascii="Faruma" w:hAnsi="Faruma" w:cs="Faruma"/>
+          <w:rtl/>
+        </w:rPr>
+        <w:t>ސްނުކޮށް ވެރިފަރާތައް އެކަން އ</w:t>
+      </w:r>
+      <w:r>
+        <w:rPr>
+          <w:rFonts w:ascii="Faruma" w:hAnsi="Faruma" w:cs="Faruma"/>
+          <w:rtl/>
+        </w:rPr>
+        <w:t>ަ</w:t>
+      </w:r>
+      <w:r>
+        <w:rPr>
+          <w:rFonts w:ascii="Faruma" w:hAnsi="Faruma" w:cs="Faruma"/>
+          <w:rtl/>
+        </w:rPr>
+        <w:t xml:space="preserve">ންގަން ވާނެއެވެ. އަދި އެފަދަ ގެއްލުމެއް މަރާމާތު ކުރަންވާނީ ވެރިފަރާތާއި މަޝްވަރާ ކުރުމަށްފަހު </w:t>
+      </w:r>
+      <w:r>
+        <w:rPr>
+          <w:rFonts w:ascii="Faruma" w:hAnsi="Faruma" w:cs="Faruma"/>
+          <w:rtl/>
+        </w:rPr>
+        <w:t>ވެރިފަރާތުން</w:t>
+      </w:r>
+      <w:r>
+        <w:rPr>
+          <w:rFonts w:ascii="Faruma" w:hAnsi="Faruma" w:cs="Faruma" w:hint="cs"/>
+          <w:rtl/>
+        </w:rPr>
+        <w:t xml:space="preserve"> </w:t>
+      </w:r>
+      <w:r>
+        <w:rPr>
+          <w:rFonts w:ascii="Faruma" w:hAnsi="Faruma" w:cs="Faruma"/>
+          <w:rtl/>
+        </w:rPr>
+        <w:t xml:space="preserve"> އަންގާގޮތަކަށެވެ. އަދި ހަލާކުވީއެއްޗެއްގެ ބަދަލުގައި ބަދަލުކުރާ އެއްވެސްއެއްޗެއް، އިމާރާތްކުއްޔަށް ދިންއިރު ހުރި ކޮލިޓީ އަށްވުރެ ދަށްވެގެން ނުވާނެއެވެ.</w:t>
+      </w:r>
+    </w:p>
+    <w:p>
+      <w:pPr>
+        <w:pStyle w:val="ListParagraph"/>
+        <w:spacing w:after="0"/>
+        <w:ind w:right="440" w:firstLine="360"/>
+        <w:jc w:val="right"/>
+        <w:rPr>
+          <w:rFonts w:ascii="Faruma" w:hAnsi="Faruma" w:cs="Faruma"/>
+          <w:lang w:bidi="dv-MV"/>
+        </w:rPr>
+      </w:pPr>
+    </w:p>
+    <w:p>
+      <w:pPr>
+        <w:pStyle w:val="ListParagraph"/>
+        <w:spacing w:after="0"/>
+        <w:ind w:right="440" w:firstLine="360"/>
+        <w:jc w:val="right"/>
+        <w:rPr>
+          <w:rFonts w:ascii="Faruma" w:hAnsi="Faruma" w:cs="MV Boli"/>
+          <w:rtl/>
+        </w:rPr>
+      </w:pPr>
+      <w:r>
+        <w:rPr>
+          <w:rFonts w:ascii="Faruma" w:hAnsi="Faruma" w:cs="Faruma" w:hint="cs"/>
+          <w:b/>
+          <w:bCs/>
+          <w:rtl/>
+        </w:rPr>
+        <w:t>1</w:t>
+      </w:r>
+      <w:r>
+        <w:rPr>
+          <w:rFonts w:ascii="Faruma" w:hAnsi="Faruma" w:cs="Faruma" w:hint="cs"/>
+          <w:b/>
+          <w:bCs/>
+          <w:rtl/>
+        </w:rPr>
+        <w:t>1</w:t>
+      </w:r>
+      <w:r>
+        <w:rPr>
+          <w:rFonts w:ascii="Faruma" w:hAnsi="Faruma" w:cs="Faruma" w:hint="cs"/>
+          <w:b/>
+          <w:bCs/>
+          <w:rtl/>
+        </w:rPr>
+        <w:t>-</w:t>
+      </w:r>
+      <w:r>
+        <w:rPr>
+          <w:rFonts w:ascii="Faruma" w:hAnsi="Faruma" w:cs="Faruma"/>
+          <w:b/>
+          <w:bCs/>
+          <w:rtl/>
+        </w:rPr>
+        <w:t xml:space="preserve"> </w:t>
+      </w:r>
+      <w:r>
+        <w:rPr>
+          <w:rFonts w:ascii="Faruma" w:hAnsi="Faruma" w:cs="Faruma" w:hint="cs"/>
+          <w:color w:val="EE0000"/>
+          <w:rtl/>
+          <w:lang w:bidi="dv-MV"/>
+        </w:rPr>
+        <w:t>ފްލޯނަންބަރު</w:t>
+      </w:r>
+      <w:r>
+        <w:rPr>
+          <w:rFonts w:ascii="Faruma" w:hAnsi="Faruma" w:cs="Faruma"/>
+          <w:rtl/>
+        </w:rPr>
+        <w:t>ބުރީގެ ކު</w:t>
+      </w:r>
+      <w:r>
+        <w:rPr>
+          <w:rFonts w:ascii="Faruma" w:hAnsi="Faruma" w:cs="Faruma" w:hint="cs"/>
+          <w:rtl/>
+        </w:rPr>
+        <w:t>ނިއާ</w:t>
+      </w:r>
+      <w:r>
+        <w:rPr>
+          <w:rFonts w:ascii="Faruma" w:hAnsi="Faruma" w:cs="Faruma"/>
+          <w:rtl/>
+        </w:rPr>
+        <w:t>އި އަދި މިނޫންވެސް އެބާވަތުގެ އު</w:t>
+      </w:r>
+      <w:r>
+        <w:rPr>
+          <w:rFonts w:ascii="Faruma" w:hAnsi="Faruma" w:cs="Faruma"/>
+          <w:rtl/>
+        </w:rPr>
+        <w:t>ކާ</w:t>
+      </w:r>
+      <w:r>
+        <w:rPr>
+          <w:rFonts w:ascii="Faruma" w:hAnsi="Faruma" w:cs="Faruma"/>
+          <w:rtl/>
+        </w:rPr>
+        <w:t>ލަންޖެހޭ ކުނިވާފަދަ ތަކެތ</w:t>
+      </w:r>
+      <w:r>
+        <w:rPr>
+          <w:rFonts w:ascii="Faruma" w:hAnsi="Faruma" w:cs="Faruma" w:hint="cs"/>
+          <w:rtl/>
+        </w:rPr>
+        <w:t xml:space="preserve">ި ބަހައްޓަންވާނީ ސިޑިގޮޅި ހަޑިނުވާ ގޮތަކަށް، ރަނގަޅަށް ޕެކްކޮފަ، </w:t>
+      </w:r>
+      <w:r>
+        <w:rPr>
+          <w:rFonts w:ascii="Faruma" w:hAnsi="Faruma" w:cs="Faruma" w:hint="cs"/>
+          <w:color w:val="EE0000"/>
+          <w:rtl/>
+          <w:lang w:bidi="dv-MV"/>
+        </w:rPr>
+        <w:t>ފްލޯނަންބަރު</w:t>
+      </w:r>
+      <w:r>
+        <w:rPr>
+          <w:rFonts w:ascii="Faruma" w:hAnsi="Faruma" w:cs="Faruma" w:hint="cs"/>
+          <w:rtl/>
+        </w:rPr>
+        <w:t xml:space="preserve">ބުރީގެ ދޮރުކުރިމަތީން ވެމްކޯގެ ޤަވާއިދުތަކާ އެއްގޮތް ވާގޮތުގެމަތިންނެވެ. </w:t>
+      </w:r>
+      <w:r>
+        <w:rPr>
+          <w:rFonts w:ascii="Faruma" w:hAnsi="Faruma" w:cs="Faruma" w:hint="cs"/>
+          <w:rtl/>
+        </w:rPr>
+        <w:t xml:space="preserve">އަދި ކުނިބަހަށްޓާ ސަރަހައްދުގެ ސާފުތާހިރުކަން ބެލެހެއްޓުމަކީ ކުއްޔަށް ހިފިފަރާތުގެ ޒިންމާއެކެވެ. </w:t>
+      </w:r>
+      <w:r>
+        <w:rPr>
+          <w:rFonts w:ascii="Faruma" w:hAnsi="Faruma" w:cs="Faruma" w:hint="cs"/>
+          <w:rtl/>
+        </w:rPr>
+        <w:t>ގުރައުންޑް ފްލޯގެ ގޯޅި ގަނޑުގައި ކުނިބެހެއްޓުމަކީ މަނާ ކަމެކެވެ.</w:t>
+      </w:r>
+    </w:p>
+    <w:p>
+      <w:pPr>
+        <w:pStyle w:val="ListParagraph"/>
+        <w:spacing w:after="0"/>
+        <w:ind w:right="440" w:firstLine="360"/>
+        <w:jc w:val="right"/>
+        <w:rPr>
+          <w:rFonts w:ascii="Faruma" w:hAnsi="Faruma" w:cs="Faruma"/>
+          <w:rtl/>
+        </w:rPr>
+      </w:pPr>
+    </w:p>
+    <w:p>
+      <w:pPr>
+        <w:pStyle w:val="ListParagraph"/>
+        <w:spacing w:after="0"/>
+        <w:ind w:right="440" w:firstLine="360"/>
+        <w:jc w:val="right"/>
+        <w:rPr>
+          <w:rFonts w:ascii="Faruma" w:hAnsi="Faruma" w:cs="Faruma"/>
+          <w:rtl/>
+        </w:rPr>
+      </w:pPr>
+      <w:r>
+        <w:rPr>
+          <w:rFonts w:ascii="Faruma" w:hAnsi="Faruma" w:cs="Faruma" w:hint="cs"/>
+          <w:b/>
+          <w:bCs/>
+          <w:rtl/>
+        </w:rPr>
+        <w:t>1</w:t>
+      </w:r>
+      <w:r>
+        <w:rPr>
+          <w:rFonts w:ascii="Faruma" w:hAnsi="Faruma" w:cs="Faruma" w:hint="cs"/>
+          <w:b/>
+          <w:bCs/>
+          <w:rtl/>
+        </w:rPr>
+        <w:t>2</w:t>
+      </w:r>
+      <w:r>
+        <w:rPr>
+          <w:rFonts w:ascii="Faruma" w:hAnsi="Faruma" w:cs="Faruma" w:hint="cs"/>
+          <w:b/>
+          <w:bCs/>
+          <w:rtl/>
+        </w:rPr>
+        <w:t>-</w:t>
+      </w:r>
+      <w:r>
+        <w:rPr>
+          <w:rFonts w:ascii="Faruma" w:hAnsi="Faruma" w:cs="Faruma"/>
+          <w:b/>
+          <w:bCs/>
+          <w:rtl/>
+        </w:rPr>
+        <w:t xml:space="preserve"> </w:t>
+      </w:r>
+      <w:r>
+        <w:rPr>
+          <w:rFonts w:ascii="Faruma" w:hAnsi="Faruma" w:cs="Faruma"/>
+          <w:rtl/>
+        </w:rPr>
+        <w:t>ކުއްޔަށްހިފި މުއްދަތުގެ ތެރޭގައި އިމާރާތުގައި އިސްލާމްދީނާއި، ދިވެހިރާއްޖޭގެ</w:t>
+      </w:r>
+      <w:r>
+        <w:rPr>
+          <w:rFonts w:ascii="Faruma" w:hAnsi="Faruma" w:cs="Faruma"/>
+          <w:rtl/>
+        </w:rPr>
+        <w:t xml:space="preserve"> ޤާނޫނާއި ޙިލާފު އެއްވެސް ޢަމަލެއް ކުއްޔަށް ހިފިފަރާތުން ހިންގައިފިނަމަ އެކަމެއްގެ ފުރިހަމަ ޒިންމާ، ކުއްޔަށްހިފި ފަރާތުން އުފުލަން ޖެހޭނެއެވެ.</w:t>
+      </w:r>
+    </w:p>
+    <w:p>
+      <w:pPr>
+        <w:pStyle w:val="ListParagraph"/>
+        <w:spacing w:after="0"/>
+        <w:ind w:right="440" w:firstLine="360"/>
+        <w:jc w:val="right"/>
+        <w:rPr>
+          <w:rFonts w:ascii="Faruma" w:hAnsi="Faruma" w:cs="Faruma"/>
+          <w:b/>
+          <w:bCs/>
+          <w:rtl/>
+        </w:rPr>
+      </w:pPr>
+    </w:p>
+    <w:p>
+      <w:pPr>
+        <w:pStyle w:val="ListParagraph"/>
+        <w:spacing w:after="0"/>
+        <w:ind w:right="440" w:firstLine="360"/>
+        <w:jc w:val="right"/>
+        <w:rPr>
+          <w:rFonts w:ascii="Faruma" w:hAnsi="Faruma" w:cs="Faruma"/>
+          <w:rtl/>
+        </w:rPr>
+      </w:pPr>
+      <w:r>
+        <w:rPr>
+          <w:rFonts w:ascii="Faruma" w:hAnsi="Faruma" w:cs="Faruma" w:hint="cs"/>
+          <w:b/>
+          <w:bCs/>
+          <w:rtl/>
+        </w:rPr>
+        <w:t>1</w:t>
+      </w:r>
+      <w:r>
+        <w:rPr>
+          <w:rFonts w:ascii="Faruma" w:hAnsi="Faruma" w:cs="Faruma" w:hint="cs"/>
+          <w:b/>
+          <w:bCs/>
+          <w:rtl/>
+        </w:rPr>
+        <w:t>3</w:t>
+      </w:r>
+      <w:r>
+        <w:rPr>
+          <w:rFonts w:ascii="Faruma" w:hAnsi="Faruma" w:cs="Faruma" w:hint="cs"/>
+          <w:b/>
+          <w:bCs/>
+          <w:rtl/>
+        </w:rPr>
+        <w:t>-</w:t>
+      </w:r>
+      <w:r>
+        <w:rPr>
+          <w:rFonts w:ascii="Faruma" w:hAnsi="Faruma" w:cs="Faruma"/>
+          <w:b/>
+          <w:bCs/>
+          <w:rtl/>
+        </w:rPr>
+        <w:t xml:space="preserve"> </w:t>
+      </w:r>
+      <w:r>
+        <w:rPr>
+          <w:rFonts w:ascii="Faruma" w:hAnsi="Faruma" w:cs="Faruma"/>
+          <w:rtl/>
+        </w:rPr>
+        <w:t>ކުއްޔަށްހިފި</w:t>
+      </w:r>
+      <w:r>
+        <w:rPr>
+          <w:rFonts w:ascii="Faruma" w:hAnsi="Faruma" w:cs="Faruma"/>
+          <w:rtl/>
+        </w:rPr>
+        <w:t xml:space="preserve"> ފަރާތުން އެހެން ފަރާތަކަށް </w:t>
+      </w:r>
+      <w:r>
+        <w:rPr>
+          <w:rFonts w:ascii="Faruma" w:hAnsi="Faruma" w:cs="Faruma" w:hint="cs"/>
+          <w:color w:val="EE0000"/>
+          <w:rtl/>
+          <w:lang w:bidi="dv-MV"/>
+        </w:rPr>
+        <w:t>ފްލޯނަންބަރު</w:t>
+      </w:r>
+      <w:r>
+        <w:rPr>
+          <w:rFonts w:ascii="Faruma" w:hAnsi="Faruma" w:cs="Faruma"/>
+          <w:rtl/>
+        </w:rPr>
+        <w:t>ބުރި ކުއްޔަށް</w:t>
+      </w:r>
+      <w:r>
+        <w:rPr>
+          <w:rFonts w:ascii="Faruma" w:hAnsi="Faruma" w:cs="Faruma" w:hint="cs"/>
+          <w:rtl/>
+        </w:rPr>
+        <w:t>ދިނުމަކީ މަނާ ކަމެކެވެ.</w:t>
+      </w:r>
+    </w:p>
+    <w:p>
+      <w:pPr>
+        <w:pStyle w:val="ListParagraph"/>
+        <w:spacing w:after="0"/>
+        <w:ind w:right="440" w:firstLine="360"/>
+        <w:jc w:val="right"/>
+        <w:rPr>
+          <w:rFonts w:ascii="Faruma" w:hAnsi="Faruma" w:cs="Faruma"/>
+          <w:b/>
+          <w:bCs/>
+          <w:rtl/>
+        </w:rPr>
+      </w:pPr>
+    </w:p>
+    <w:p>
+      <w:pPr>
+        <w:pStyle w:val="ListParagraph"/>
+        <w:spacing w:after="0"/>
+        <w:ind w:right="440" w:firstLine="360"/>
+        <w:jc w:val="right"/>
+        <w:rPr>
+          <w:rFonts w:ascii="Faruma" w:hAnsi="Faruma" w:cs="Faruma"/>
+          <w:rtl/>
+        </w:rPr>
+      </w:pPr>
+      <w:r>
+        <w:rPr>
+          <w:rFonts w:ascii="Faruma" w:hAnsi="Faruma" w:cs="Faruma" w:hint="cs"/>
+          <w:b/>
+          <w:bCs/>
+          <w:rtl/>
+        </w:rPr>
+        <w:t>1</w:t>
+      </w:r>
+      <w:r>
+        <w:rPr>
+          <w:rFonts w:ascii="Faruma" w:hAnsi="Faruma" w:cs="Faruma" w:hint="cs"/>
+          <w:b/>
+          <w:bCs/>
+          <w:rtl/>
+        </w:rPr>
+        <w:t>4</w:t>
+      </w:r>
+      <w:r>
+        <w:rPr>
+          <w:rFonts w:ascii="Faruma" w:hAnsi="Faruma" w:cs="Faruma" w:hint="cs"/>
+          <w:b/>
+          <w:bCs/>
+          <w:rtl/>
+        </w:rPr>
+        <w:t>-</w:t>
+      </w:r>
+      <w:r>
+        <w:rPr>
+          <w:rFonts w:ascii="Faruma" w:hAnsi="Faruma" w:cs="Faruma"/>
+          <w:b/>
+          <w:bCs/>
+          <w:rtl/>
+        </w:rPr>
+        <w:t xml:space="preserve"> </w:t>
+      </w:r>
+      <w:r>
+        <w:rPr>
+          <w:rFonts w:ascii="Faruma" w:hAnsi="Faruma" w:cs="Faruma"/>
+          <w:rtl/>
+        </w:rPr>
+        <w:t>ކުއްޔަށްހިފި ފަރާތުން އެޕާޓްމަންޓް ދޫކޮށްލާނަމަ، ދެމަސް ދުވަސް ކުރިން ވެރިފަރާތައް އެކަން އ</w:t>
+      </w:r>
+      <w:r>
+        <w:rPr>
+          <w:rFonts w:ascii="Faruma" w:hAnsi="Faruma" w:cs="Faruma"/>
+          <w:rtl/>
+        </w:rPr>
+        <w:t>ަ</w:t>
+      </w:r>
+      <w:r>
+        <w:rPr>
+          <w:rFonts w:ascii="Faruma" w:hAnsi="Faruma" w:cs="Faruma"/>
+          <w:rtl/>
+        </w:rPr>
+        <w:t xml:space="preserve">ންގަންވާނެއެވެ. </w:t>
+      </w:r>
+    </w:p>
+    <w:p>
+      <w:pPr>
+        <w:spacing w:after="0"/>
+        <w:ind w:right="880"/>
+        <w:rPr>
+          <w:rFonts w:ascii="Faruma" w:hAnsi="Faruma" w:cs="Faruma"/>
+          <w:rtl/>
+        </w:rPr>
+      </w:pPr>
+    </w:p>
+    <w:p>
+      <w:pPr>
+        <w:pStyle w:val="ListParagraph"/>
+        <w:spacing w:after="0"/>
+        <w:ind w:right="440" w:firstLine="360"/>
+        <w:jc w:val="right"/>
+        <w:rPr>
+          <w:rFonts w:ascii="Faruma" w:hAnsi="Faruma" w:cs="Faruma"/>
+          <w:rtl/>
+        </w:rPr>
+      </w:pPr>
+      <w:r>
+        <w:rPr>
+          <w:rFonts w:ascii="Faruma" w:hAnsi="Faruma" w:cs="Faruma" w:hint="cs"/>
+          <w:b/>
+          <w:bCs/>
+          <w:rtl/>
+        </w:rPr>
+        <w:t>1</w:t>
+      </w:r>
+      <w:r>
+        <w:rPr>
+          <w:rFonts w:ascii="Faruma" w:hAnsi="Faruma" w:cs="Faruma" w:hint="cs"/>
+          <w:b/>
+          <w:bCs/>
+          <w:rtl/>
+        </w:rPr>
+        <w:t>5</w:t>
+      </w:r>
+      <w:r>
+        <w:rPr>
+          <w:rFonts w:ascii="Faruma" w:hAnsi="Faruma" w:cs="Faruma" w:hint="cs"/>
+          <w:b/>
+          <w:bCs/>
+          <w:rtl/>
+        </w:rPr>
+        <w:t>-</w:t>
+      </w:r>
+      <w:r>
+        <w:rPr>
+          <w:rFonts w:ascii="Faruma" w:hAnsi="Faruma" w:cs="Faruma"/>
+          <w:b/>
+          <w:bCs/>
+          <w:rtl/>
+        </w:rPr>
+        <w:t xml:space="preserve"> </w:t>
+      </w:r>
+      <w:r>
+        <w:rPr>
+          <w:rFonts w:ascii="Faruma" w:hAnsi="Faruma" w:cs="Faruma"/>
+          <w:rtl/>
+        </w:rPr>
+        <w:t>މިއެގްރިމަންޓްގައި އެއްބަސްވެފަ</w:t>
+      </w:r>
+      <w:r>
+        <w:rPr>
+          <w:rFonts w:ascii="Faruma" w:hAnsi="Faruma" w:cs="Faruma"/>
+          <w:rtl/>
+        </w:rPr>
+        <w:t>އި</w:t>
+      </w:r>
+      <w:r>
+        <w:rPr>
+          <w:rFonts w:ascii="Faruma" w:hAnsi="Faruma" w:cs="Faruma"/>
+          <w:rtl/>
+        </w:rPr>
+        <w:t>ވާ ކަމެއްގެ އިތުރުން އެއްވެސް މައްސަލައެއް ދިމާވެއްޖެ ނަމަ އެ މައްސްލައެއް ފުރަތަމަ ޙައްލު ކުރާނީ ދެފަރާތް ވާހަކަދައްކާ ސުލްހަވެރިކޮށެވެ. އަދި މިގޮތުން އެމައްސަލައެއް ޙައްލު ނުވެއްޖެނަމަ ދެން އެމައަސަލައެއް ޙައްލުކުރާނީ ކަމާބެހޭ ފަރާތެއް މެދުވެރިކޮށެވެ.</w:t>
+      </w:r>
+    </w:p>
+    <w:p>
+      <w:pPr>
+        <w:pStyle w:val="ListParagraph"/>
+        <w:spacing w:after="0"/>
+        <w:ind w:right="440" w:firstLine="360"/>
+        <w:jc w:val="right"/>
+        <w:rPr>
+          <w:rFonts w:ascii="Faruma" w:hAnsi="Faruma" w:cs="Faruma"/>
+          <w:rtl/>
+        </w:rPr>
+      </w:pPr>
+    </w:p>
+    <w:p>
+      <w:pPr>
+        <w:pStyle w:val="ListParagraph"/>
+        <w:spacing w:after="0"/>
+        <w:ind w:right="440" w:firstLine="360"/>
+        <w:jc w:val="right"/>
+        <w:rPr>
+          <w:rFonts w:ascii="Faruma" w:hAnsi="Faruma" w:cs="Faruma"/>
+          <w:rtl/>
+        </w:rPr>
+      </w:pPr>
+      <w:r>
+        <w:rPr>
+          <w:rFonts w:ascii="Faruma" w:hAnsi="Faruma" w:cs="Faruma" w:hint="cs"/>
+          <w:b/>
+          <w:bCs/>
+          <w:rtl/>
+        </w:rPr>
+        <w:t>1</w:t>
+      </w:r>
+      <w:r>
+        <w:rPr>
+          <w:rFonts w:ascii="Faruma" w:hAnsi="Faruma" w:cs="Faruma" w:hint="cs"/>
+          <w:b/>
+          <w:bCs/>
+          <w:rtl/>
+        </w:rPr>
+        <w:t>6</w:t>
+      </w:r>
+      <w:r>
+        <w:rPr>
+          <w:rFonts w:ascii="Faruma" w:hAnsi="Faruma" w:cs="Faruma" w:hint="cs"/>
+          <w:b/>
+          <w:bCs/>
+          <w:rtl/>
+        </w:rPr>
+        <w:t>-</w:t>
+      </w:r>
+      <w:r>
+        <w:rPr>
+          <w:rFonts w:ascii="Faruma" w:hAnsi="Faruma" w:cs="Faruma"/>
+          <w:b/>
+          <w:bCs/>
+          <w:rtl/>
+        </w:rPr>
+        <w:t xml:space="preserve"> </w:t>
+      </w:r>
+      <w:r>
+        <w:rPr>
+          <w:rFonts w:ascii="Faruma" w:hAnsi="Faruma" w:cs="Faruma"/>
+          <w:rtl/>
+        </w:rPr>
+        <w:t xml:space="preserve">މިއެގްރިމެންޓްގެ މުއްދަތު </w:t>
+      </w:r>
+      <w:r>
+        <w:rPr>
+          <w:rFonts w:ascii="Faruma" w:hAnsi="Faruma" w:cs="Faruma"/>
+          <w:rtl/>
+        </w:rPr>
+        <w:t xml:space="preserve">ހަމަވުމަށްފަލު ވެރިފަރާތުން </w:t>
+      </w:r>
+      <w:r>
+        <w:rPr>
+          <w:rFonts w:ascii="Faruma" w:hAnsi="Faruma" w:cs="Faruma" w:hint="cs"/>
+          <w:color w:val="EE0000"/>
+          <w:rtl/>
+          <w:lang w:bidi="dv-MV"/>
+        </w:rPr>
+        <w:t>ފްލޯނަންބަރު</w:t>
+      </w:r>
+      <w:r>
+        <w:rPr>
+          <w:rFonts w:ascii="Faruma" w:hAnsi="Faruma" w:cs="Faruma"/>
+          <w:rtl/>
+        </w:rPr>
+        <w:t>ބުރި އެއްވެސް ފަރާތަކަށް ކުއްޔަށް ދޭނަމަ، ކުއްޔަށ</w:t>
+      </w:r>
+      <w:r>
+        <w:rPr>
+          <w:rFonts w:ascii="Faruma" w:hAnsi="Faruma" w:cs="Faruma"/>
+          <w:rtl/>
+        </w:rPr>
+        <w:t>ް</w:t>
+      </w:r>
+      <w:r>
+        <w:rPr>
+          <w:rFonts w:ascii="Faruma" w:hAnsi="Faruma" w:cs="Faruma"/>
+          <w:rtl/>
+        </w:rPr>
+        <w:t xml:space="preserve"> ހިފި ފަރާތަށް އިސްކަންދޭންވާނެއެވެ.</w:t>
+      </w:r>
+    </w:p>
+    <w:p>
+      <w:pPr>
+        <w:pStyle w:val="ListParagraph"/>
+        <w:spacing w:after="0"/>
+        <w:ind w:right="440" w:firstLine="360"/>
+        <w:jc w:val="right"/>
+        <w:rPr>
+          <w:rFonts w:ascii="Faruma" w:hAnsi="Faruma" w:cs="Faruma"/>
+          <w:rtl/>
+        </w:rPr>
+      </w:pPr>
+    </w:p>
+    <w:p>
+      <w:pPr>
+        <w:pStyle w:val="ListParagraph"/>
+        <w:spacing w:after="0"/>
+        <w:ind w:right="440" w:firstLine="360"/>
+        <w:jc w:val="right"/>
+        <w:rPr>
+          <w:rFonts w:ascii="Faruma" w:hAnsi="Faruma" w:cs="Faruma"/>
+          <w:rtl/>
+        </w:rPr>
+      </w:pPr>
+      <w:r>
+        <w:rPr>
+          <w:rFonts w:ascii="Faruma" w:hAnsi="Faruma" w:cs="Faruma" w:hint="cs"/>
+          <w:b/>
+          <w:bCs/>
+          <w:rtl/>
+        </w:rPr>
+        <w:t>1</w:t>
+      </w:r>
+      <w:r>
+        <w:rPr>
+          <w:rFonts w:ascii="Faruma" w:hAnsi="Faruma" w:cs="Faruma" w:hint="cs"/>
+          <w:b/>
+          <w:bCs/>
+          <w:rtl/>
+        </w:rPr>
+        <w:t>7</w:t>
+      </w:r>
+      <w:r>
+        <w:rPr>
+          <w:rFonts w:ascii="Faruma" w:hAnsi="Faruma" w:cs="Faruma" w:hint="cs"/>
+          <w:b/>
+          <w:bCs/>
+          <w:rtl/>
+        </w:rPr>
+        <w:t>-</w:t>
+      </w:r>
+      <w:r>
+        <w:rPr>
+          <w:rFonts w:ascii="Faruma" w:hAnsi="Faruma" w:cs="Faruma"/>
+          <w:b/>
+          <w:bCs/>
+          <w:rtl/>
+        </w:rPr>
+        <w:t xml:space="preserve"> </w:t>
+      </w:r>
+      <w:r>
+        <w:rPr>
+          <w:rFonts w:ascii="Faruma" w:hAnsi="Faruma" w:cs="Faruma"/>
+          <w:rtl/>
+        </w:rPr>
+        <w:t xml:space="preserve">މި އެގްރިމަންޓްގެ </w:t>
+      </w:r>
+      <w:r>
+        <w:rPr>
+          <w:rFonts w:ascii="Faruma" w:hAnsi="Faruma" w:cs="Faruma" w:hint="cs"/>
+          <w:rtl/>
+        </w:rPr>
+        <w:t>ހަތަރުވަނަ</w:t>
+      </w:r>
+      <w:r>
+        <w:rPr>
+          <w:rFonts w:ascii="Faruma" w:hAnsi="Faruma" w:cs="Faruma"/>
+          <w:rtl/>
+        </w:rPr>
+        <w:t>ވަނަ މާއްދާގައި އެއްބަސްވެފައިވާ ކުލި، ކުއްޔަށް ހިފިފަރާތުން މި އެގްރިމަންޓްގެ ހަވަނަ މ</w:t>
+      </w:r>
+      <w:r>
+        <w:rPr>
+          <w:rFonts w:ascii="Faruma" w:hAnsi="Faruma" w:cs="Faruma"/>
+          <w:rtl/>
+        </w:rPr>
+        <w:t>ާއްދާއާއި އެއްގޮތައް ނުދައްކައިފި ނަމަ، މި އެގްރިމަންޓް ބާތިލުކުރުމުގެ ފުރިހަމަ އިޙްތިޔާރު ވެރިފަރާތަށް ލިބިގެންވެއެވެ.</w:t>
+      </w:r>
+    </w:p>
+    <w:p>
+      <w:pPr>
+        <w:pStyle w:val="ListParagraph"/>
+        <w:spacing w:after="0"/>
+        <w:ind w:right="440" w:firstLine="360"/>
+        <w:jc w:val="right"/>
+        <w:rPr>
+          <w:rFonts w:ascii="Faruma" w:hAnsi="Faruma" w:cs="Faruma"/>
+          <w:rtl/>
+        </w:rPr>
+      </w:pPr>
+    </w:p>
+    <w:p>
+      <w:pPr>
+        <w:pStyle w:val="ListParagraph"/>
+        <w:spacing w:after="0"/>
+        <w:ind w:right="440" w:firstLine="360"/>
+        <w:jc w:val="right"/>
+        <w:rPr>
+          <w:rFonts w:ascii="Faruma" w:hAnsi="Faruma" w:cs="Faruma"/>
+          <w:rtl/>
+        </w:rPr>
+      </w:pPr>
+      <w:r>
+        <w:rPr>
+          <w:rFonts w:ascii="Faruma" w:hAnsi="Faruma" w:cs="Faruma" w:hint="cs"/>
+          <w:b/>
+          <w:bCs/>
+          <w:rtl/>
+        </w:rPr>
+        <w:t>1</w:t>
+      </w:r>
+      <w:r>
+        <w:rPr>
+          <w:rFonts w:ascii="Faruma" w:hAnsi="Faruma" w:cs="Faruma" w:hint="cs"/>
+          <w:b/>
+          <w:bCs/>
+          <w:rtl/>
+        </w:rPr>
+        <w:t>8</w:t>
+      </w:r>
+      <w:r>
+        <w:rPr>
+          <w:rFonts w:ascii="Faruma" w:hAnsi="Faruma" w:cs="Faruma" w:hint="cs"/>
+          <w:b/>
+          <w:bCs/>
+          <w:rtl/>
+        </w:rPr>
+        <w:t>-</w:t>
+      </w:r>
+      <w:r>
+        <w:rPr>
+          <w:rFonts w:ascii="Faruma" w:hAnsi="Faruma" w:cs="Faruma"/>
+          <w:b/>
+          <w:bCs/>
+          <w:rtl/>
+        </w:rPr>
+        <w:t xml:space="preserve"> </w:t>
+      </w:r>
+      <w:r>
+        <w:rPr>
+          <w:rFonts w:ascii="Faruma" w:hAnsi="Faruma" w:cs="Faruma"/>
+          <w:rtl/>
+        </w:rPr>
+        <w:t>މި އެގްރިމަންޓްގެ ސަތާ</w:t>
+      </w:r>
+      <w:r>
+        <w:rPr>
+          <w:rFonts w:ascii="Faruma" w:hAnsi="Faruma" w:cs="Faruma"/>
+          <w:rtl/>
+        </w:rPr>
+        <w:t>ރަވަނަ މާއްދާގެ ދަށުން މި އެގްރިމަންޓް ބާތިލް ކުރިނަމ</w:t>
+      </w:r>
+      <w:r>
+        <w:rPr>
+          <w:rFonts w:ascii="Faruma" w:hAnsi="Faruma" w:cs="Faruma"/>
+          <w:rtl/>
+        </w:rPr>
+        <w:t xml:space="preserve">ަވެސް، ކުއްޔަށްހިފި </w:t>
+      </w:r>
+      <w:r>
+        <w:rPr>
+          <w:rFonts w:ascii="Faruma" w:hAnsi="Faruma" w:cs="Faruma"/>
+          <w:rtl/>
+        </w:rPr>
+        <w:t xml:space="preserve">ފަރާތުން </w:t>
+      </w:r>
+      <w:r>
+        <w:rPr>
+          <w:rFonts w:ascii="Faruma" w:hAnsi="Faruma" w:cs="Faruma" w:hint="cs"/>
+          <w:color w:val="EE0000"/>
+          <w:rtl/>
+          <w:lang w:bidi="dv-MV"/>
+        </w:rPr>
+        <w:t>ފްލޯނަންބަރު</w:t>
+      </w:r>
+      <w:r>
+        <w:rPr>
+          <w:rFonts w:ascii="Faruma" w:hAnsi="Faruma" w:cs="Faruma"/>
+          <w:rtl/>
+        </w:rPr>
+        <w:t>ބުރި ބޭނުންކުރި މުއްދަތަށް ވެރިފަރާތައް މިއެގްރިމަންޓްގެ</w:t>
+      </w:r>
+      <w:r>
+        <w:rPr>
+          <w:rFonts w:ascii="Faruma" w:hAnsi="Faruma" w:cs="Faruma" w:hint="cs"/>
+          <w:rtl/>
+          <w:lang w:bidi="dv-MV"/>
+        </w:rPr>
+        <w:t xml:space="preserve"> ދެވަނަ</w:t>
+      </w:r>
+      <w:r>
+        <w:rPr>
+          <w:rFonts w:ascii="Faruma" w:hAnsi="Faruma" w:cs="Faruma"/>
+          <w:rtl/>
+        </w:rPr>
+        <w:t xml:space="preserve"> މާއްދާގައި އެއްބަސްވި ކުލި ދައްކަން ޖެހޭނެއެވެ. އަދި ކުއްޔަށްހިފި</w:t>
+      </w:r>
+      <w:r>
+        <w:rPr>
+          <w:rFonts w:ascii="Faruma" w:hAnsi="Faruma" w:cs="Faruma"/>
+          <w:rtl/>
+        </w:rPr>
+        <w:t xml:space="preserve"> ފަރާތުގެ ސަބަބުން އިމާރާތަށާއި </w:t>
+      </w:r>
+      <w:r>
+        <w:rPr>
+          <w:rFonts w:ascii="Faruma" w:hAnsi="Faruma" w:cs="Faruma" w:hint="cs"/>
+          <w:color w:val="EE0000"/>
+          <w:rtl/>
+          <w:lang w:bidi="dv-MV"/>
+        </w:rPr>
+        <w:t>ފްލޯނަންބަރު</w:t>
+      </w:r>
+      <w:r>
+        <w:rPr>
+          <w:rFonts w:ascii="Faruma" w:hAnsi="Faruma" w:cs="Faruma"/>
+          <w:rtl/>
+        </w:rPr>
+        <w:t>ބުރި (އެޕާޓްމަންޓް) އަށް އެއްވެސް ގެއްލުމެއް ލިބިފައި ހުރިނަމަ އެކަމުގެ ޒިންމާ އުފުލުމައްފަހު، ކުއްޔަށްހިފި ފަރާތުން ވެރިފަރާތައް ބަދަލުދިނުމަށް އެއްބަސްވެއެވެ.</w:t>
+      </w:r>
+    </w:p>
+    <w:p>
+      <w:pPr>
+        <w:pStyle w:val="ListParagraph"/>
+        <w:spacing w:after="0"/>
+        <w:ind w:right="440" w:firstLine="360"/>
+        <w:jc w:val="right"/>
+        <w:rPr>
+          <w:rFonts w:ascii="Faruma" w:hAnsi="Faruma" w:cs="Faruma"/>
+          <w:rtl/>
+        </w:rPr>
+      </w:pPr>
+    </w:p>
+    <w:p>
+      <w:pPr>
+        <w:pStyle w:val="ListParagraph"/>
+        <w:spacing w:after="0"/>
+        <w:ind w:right="440" w:firstLine="360"/>
+        <w:jc w:val="right"/>
+        <w:rPr>
+          <w:rFonts w:ascii="Faruma" w:hAnsi="Faruma" w:cs="Faruma"/>
+        </w:rPr>
+      </w:pPr>
+      <w:r>
+        <w:rPr>
+          <w:rFonts w:ascii="Faruma" w:hAnsi="Faruma" w:cs="Faruma" w:hint="cs"/>
+          <w:b/>
+          <w:bCs/>
+          <w:rtl/>
+        </w:rPr>
+        <w:t>1</w:t>
+      </w:r>
+      <w:r>
+        <w:rPr>
+          <w:rFonts w:ascii="Faruma" w:hAnsi="Faruma" w:cs="Faruma" w:hint="cs"/>
+          <w:b/>
+          <w:bCs/>
+          <w:rtl/>
+        </w:rPr>
+        <w:t>9</w:t>
+      </w:r>
+      <w:r>
+        <w:rPr>
+          <w:rFonts w:ascii="Faruma" w:hAnsi="Faruma" w:cs="Faruma" w:hint="cs"/>
+          <w:b/>
+          <w:bCs/>
+          <w:rtl/>
+        </w:rPr>
+        <w:t>-</w:t>
+      </w:r>
+      <w:r>
+        <w:rPr>
+          <w:rFonts w:ascii="Faruma" w:hAnsi="Faruma" w:cs="Faruma"/>
+          <w:b/>
+          <w:bCs/>
+          <w:rtl/>
+        </w:rPr>
+        <w:t xml:space="preserve"> </w:t>
+      </w:r>
+      <w:r>
+        <w:rPr>
+          <w:rFonts w:ascii="Faruma" w:hAnsi="Faruma" w:cs="Faruma"/>
+          <w:rtl/>
+        </w:rPr>
+        <w:t>ވެރިފަރާތް ނުވަތަ ކުއްޔަށްހިފި ފަރާތުންކުރެ ފަރާތެއް ނުވަތަ ދެފަރާތުންކުރެ އެއްވެސް</w:t>
+      </w:r>
+      <w:r>
+        <w:rPr>
+          <w:rFonts w:ascii="Faruma" w:hAnsi="Faruma" w:cs="Faruma"/>
+          <w:rtl/>
+        </w:rPr>
+        <w:t>ފަރާތެއް ދުނިޔޭގައި ނެތިއްޖެނަމަ</w:t>
+      </w:r>
+      <w:r>
+        <w:rPr>
+          <w:rFonts w:ascii="Faruma" w:hAnsi="Faruma" w:cs="Times New Roman"/>
+          <w:rtl/>
+        </w:rPr>
+        <w:t>،</w:t>
+      </w:r>
+      <w:r>
+        <w:rPr>
+          <w:rFonts w:ascii="Faruma" w:hAnsi="Faruma" w:cs="Faruma"/>
+          <w:rtl/>
+        </w:rPr>
+        <w:t xml:space="preserve"> ވެރިފަރާތާއި ކުއްޔަށްހިފި ފަރާތުގެ ވާރިސުންނަށް</w:t>
+      </w:r>
+      <w:r>
+        <w:rPr>
+          <w:rFonts w:ascii="Faruma" w:hAnsi="Faruma" w:cs="Faruma"/>
+          <w:rtl/>
+        </w:rPr>
+        <w:t xml:space="preserve"> މި އެގްރިމަންޓްއަށް ޢަމަލުކުރު</w:t>
+      </w:r>
+      <w:r>
+        <w:rPr>
+          <w:rFonts w:ascii="Faruma" w:hAnsi="Faruma" w:cs="Faruma"/>
+          <w:rtl/>
+        </w:rPr>
+        <w:t>މަށް ވަސީޢަތްކުރަމެވެ.</w:t>
+      </w:r>
+    </w:p>
+    <w:p>
+      <w:pPr>
+        <w:pStyle w:val="ListParagraph"/>
+        <w:spacing w:after="0"/>
+        <w:ind w:right="440" w:firstLine="360"/>
+        <w:jc w:val="right"/>
+        <w:rPr>
+          <w:rFonts w:ascii="Faruma" w:hAnsi="Faruma" w:cs="Faruma"/>
+        </w:rPr>
+      </w:pPr>
+    </w:p>
+    <w:p>
+      <w:pPr>
+        <w:pStyle w:val="ListParagraph"/>
+        <w:spacing w:after="0"/>
+        <w:ind w:right="440" w:firstLine="360"/>
+        <w:jc w:val="right"/>
+        <w:rPr>
+          <w:rFonts w:ascii="Faruma" w:hAnsi="Faruma" w:cs="Faruma"/>
+          <w:rtl/>
+        </w:rPr>
+      </w:pPr>
+      <w:r>
+        <w:rPr>
+          <w:rFonts w:ascii="Faruma" w:hAnsi="Faruma" w:cs="Faruma" w:hint="cs"/>
+          <w:b/>
+          <w:bCs/>
           <w:rtl/>
         </w:rPr>
         <w:lastRenderedPageBreak/>
-        <w:t xml:space="preserve">ބަލާބެލުމުގައި، </w:t>
-      </w:r>
-      <w:r>
-        <w:rPr>
-          <w:rFonts w:ascii="Faruma" w:hAnsi="Faruma" w:cs="Faruma" w:hint="cs"/>
-          <w:rtl/>
-        </w:rPr>
-        <w:t>ދެވަނަ</w:t>
-      </w:r>
-      <w:r>
-        <w:rPr>
-          <w:rFonts w:ascii="Faruma" w:hAnsi="Faruma" w:cs="Faruma"/>
-          <w:rtl/>
-        </w:rPr>
-        <w:t>ބުރީގެ ސާފުތާހިރުކަން ނެތުމުގެ ސަބަބުން ޢިމާރާތައް ގެއްލުމެއް ލިބިދާނެކަމަށް ވެރިފަރާތް ފާހަގަކުރާ ކަންކަތައް ކުއްޔަށްހިފި ފަރާތުން</w:t>
-      </w:r>
-      <w:r>
-        <w:rPr>
-          <w:rFonts w:ascii="Faruma" w:hAnsi="Faruma" w:cs="Faruma"/>
-          <w:rtl/>
-        </w:rPr>
-        <w:t xml:space="preserve"> ރަނގަޅުކޮން އިޞްލާހު ކުރަންވާނެއެވެ.</w:t>
-      </w:r>
-    </w:p>
-    <w:p>
-      <w:pPr>
-        <w:pStyle w:val="ListParagraph"/>
-        <w:spacing w:after="0"/>
-        <w:ind w:right="440" w:firstLine="360"/>
-        <w:jc w:val="right"/>
-        <w:rPr>
-          <w:rFonts w:ascii="Faruma" w:hAnsi="Faruma" w:cs="Faruma"/>
-          <w:rtl/>
-        </w:rPr>
-      </w:pPr>
-    </w:p>
-    <w:p>
-      <w:pPr>
-        <w:pStyle w:val="ListParagraph"/>
-        <w:spacing w:after="0"/>
-        <w:ind w:right="440" w:firstLine="360"/>
-        <w:jc w:val="right"/>
-        <w:rPr>
-          <w:rFonts w:ascii="Faruma" w:hAnsi="Faruma" w:cs="Faruma"/>
-          <w:rtl/>
-        </w:rPr>
-      </w:pPr>
-      <w:r>
-        <w:rPr>
-          <w:rFonts w:ascii="Faruma" w:hAnsi="Faruma" w:cs="Faruma" w:hint="cs"/>
-          <w:b/>
-          <w:bCs/>
-          <w:rtl/>
-        </w:rPr>
-        <w:t>9</w:t>
-      </w:r>
-      <w:r>
-        <w:rPr>
-          <w:rFonts w:ascii="Faruma" w:hAnsi="Faruma" w:cs="Faruma" w:hint="cs"/>
-          <w:b/>
-          <w:bCs/>
-          <w:rtl/>
-        </w:rPr>
-        <w:t xml:space="preserve">- </w:t>
-      </w:r>
-      <w:r>
-        <w:rPr>
-          <w:rFonts w:ascii="Faruma" w:hAnsi="Faruma" w:cs="Faruma"/>
-          <w:rtl/>
-        </w:rPr>
-        <w:t>ޢިމާރާތުގެ ރ</w:t>
-      </w:r>
-      <w:r>
-        <w:rPr>
-          <w:rFonts w:ascii="Faruma" w:hAnsi="Faruma" w:cs="Faruma"/>
-          <w:rtl/>
-        </w:rPr>
-        <w:t>ަ</w:t>
-      </w:r>
-      <w:r>
-        <w:rPr>
-          <w:rFonts w:ascii="Faruma" w:hAnsi="Faruma" w:cs="Faruma"/>
-          <w:rtl/>
-        </w:rPr>
-        <w:t>އްކަލަށްޓަކައި، ޢިމާރާތުގެ އެއްވެސް ތަނެއް ތޮރުފާ އަދި މޮހޮރު ޖަހާ ހަދަންވާނީ ވެރިފަރާތަށް އެކަން އެނގުމަށްފަހު، ވެރިފަރާތުން އެކަމަށް ހުއްދ</w:t>
-      </w:r>
-      <w:r>
-        <w:rPr>
-          <w:rFonts w:ascii="Faruma" w:hAnsi="Faruma" w:cs="Faruma"/>
-          <w:rtl/>
-        </w:rPr>
-        <w:t xml:space="preserve">ަލިބިގެން، </w:t>
-      </w:r>
-      <w:r>
-        <w:rPr>
-          <w:rFonts w:ascii="Faruma" w:hAnsi="Faruma" w:cs="Faruma"/>
-          <w:rtl/>
-        </w:rPr>
-        <w:t>ވެރިފަރާތުން އެކަންކުރަން</w:t>
-      </w:r>
-      <w:r>
-        <w:rPr>
-          <w:rFonts w:ascii="Faruma" w:hAnsi="Faruma" w:cs="Faruma"/>
-          <w:rtl/>
-        </w:rPr>
-        <w:t xml:space="preserve"> އަންގާގޮތަކަށެވެ.</w:t>
-      </w:r>
-    </w:p>
-    <w:p>
-      <w:pPr>
-        <w:pStyle w:val="ListParagraph"/>
-        <w:spacing w:after="0"/>
-        <w:ind w:right="440" w:firstLine="360"/>
-        <w:jc w:val="right"/>
-        <w:rPr>
-          <w:rFonts w:ascii="Faruma" w:hAnsi="Faruma" w:cs="Faruma"/>
-          <w:rtl/>
-        </w:rPr>
-      </w:pPr>
-    </w:p>
-    <w:p>
-      <w:pPr>
-        <w:pStyle w:val="ListParagraph"/>
-        <w:spacing w:after="0"/>
-        <w:ind w:right="440" w:firstLine="360"/>
-        <w:jc w:val="right"/>
-        <w:rPr>
-          <w:rFonts w:ascii="Faruma" w:hAnsi="Faruma" w:cs="Faruma"/>
-          <w:rtl/>
-        </w:rPr>
-      </w:pPr>
-      <w:r>
-        <w:rPr>
-          <w:rFonts w:ascii="Faruma" w:hAnsi="Faruma" w:cs="Faruma" w:hint="cs"/>
-          <w:b/>
-          <w:bCs/>
-          <w:rtl/>
-        </w:rPr>
-        <w:t>10</w:t>
-      </w:r>
-      <w:r>
-        <w:rPr>
-          <w:rFonts w:ascii="Faruma" w:hAnsi="Faruma" w:cs="Faruma"/>
-          <w:b/>
-          <w:bCs/>
-          <w:rtl/>
-        </w:rPr>
-        <w:t>-</w:t>
-      </w:r>
-      <w:r>
-        <w:rPr>
-          <w:rFonts w:ascii="Faruma" w:hAnsi="Faruma" w:cs="Faruma"/>
-          <w:b/>
-          <w:bCs/>
-          <w:rtl/>
-        </w:rPr>
-        <w:t xml:space="preserve"> </w:t>
-      </w:r>
-      <w:r>
-        <w:rPr>
-          <w:rFonts w:ascii="Faruma" w:hAnsi="Faruma" w:cs="Faruma" w:hint="cs"/>
-          <w:rtl/>
-        </w:rPr>
-        <w:t>ދެވަނަ</w:t>
-      </w:r>
-      <w:r>
-        <w:rPr>
-          <w:rFonts w:ascii="Faruma" w:hAnsi="Faruma" w:cs="Faruma"/>
-          <w:rtl/>
-        </w:rPr>
-        <w:t>ބުރީގައި (އެޕާޓްމަންޓްގައި) ހަރުކޮއްފައިހުރި އެއްވެސް އެއްޗަކައް އެއްވެސް ބާވަތެއްގެ ގެއްލުމެއް ލިބިއްޖެނަމަ ލ</w:t>
-      </w:r>
-      <w:r>
-        <w:rPr>
-          <w:rFonts w:ascii="Faruma" w:hAnsi="Faruma" w:cs="Faruma"/>
-          <w:rtl/>
-        </w:rPr>
-        <w:t>ަ</w:t>
-      </w:r>
-      <w:r>
-        <w:rPr>
-          <w:rFonts w:ascii="Faruma" w:hAnsi="Faruma" w:cs="Faruma"/>
-          <w:rtl/>
-        </w:rPr>
-        <w:t>ސްނުކޮށް ވެރިފަރާތައް އެކަން އ</w:t>
-      </w:r>
-      <w:r>
-        <w:rPr>
-          <w:rFonts w:ascii="Faruma" w:hAnsi="Faruma" w:cs="Faruma"/>
-          <w:rtl/>
-        </w:rPr>
-        <w:t>ަ</w:t>
-      </w:r>
-      <w:r>
-        <w:rPr>
-          <w:rFonts w:ascii="Faruma" w:hAnsi="Faruma" w:cs="Faruma"/>
-          <w:rtl/>
-        </w:rPr>
-        <w:t xml:space="preserve">ންގަން ވާނެއެވެ. އަދި އެފަދަ ގެއްލުމެއް މަރާމާތު ކުރަންވާނީ ވެރިފަރާތާއި މަޝްވަރާ ކުރުމަށްފަހު </w:t>
-      </w:r>
-      <w:r>
-        <w:rPr>
-          <w:rFonts w:ascii="Faruma" w:hAnsi="Faruma" w:cs="Faruma"/>
-          <w:rtl/>
-        </w:rPr>
-        <w:t>ވެރިފަރާތުން</w:t>
-      </w:r>
-      <w:r>
-        <w:rPr>
-          <w:rFonts w:ascii="Faruma" w:hAnsi="Faruma" w:cs="Faruma" w:hint="cs"/>
-          <w:rtl/>
-        </w:rPr>
-        <w:t xml:space="preserve"> </w:t>
-      </w:r>
-      <w:r>
-        <w:rPr>
-          <w:rFonts w:ascii="Faruma" w:hAnsi="Faruma" w:cs="Faruma"/>
-          <w:rtl/>
-        </w:rPr>
-        <w:t xml:space="preserve"> އަންގާގޮތަކަށެވެ. އަދި ހަލާކުވީއެއްޗެއްގެ ބަދަލުގައި ބަދަލުކުރާ އެއްވެސްއެއްޗެއް، އިމާރާތްކުއްޔަށް ދިންއިރު ހުރި ކޮލިޓީ އަށްވުރެ ދަށްވެގެން ނުވާނެއެވެ.</w:t>
-      </w:r>
-    </w:p>
-    <w:p>
-      <w:pPr>
-        <w:pStyle w:val="ListParagraph"/>
-        <w:spacing w:after="0"/>
-        <w:ind w:right="440" w:firstLine="360"/>
-        <w:jc w:val="right"/>
-        <w:rPr>
-          <w:rFonts w:ascii="Faruma" w:hAnsi="Faruma" w:cs="Faruma"/>
-          <w:rtl/>
-        </w:rPr>
-      </w:pPr>
-    </w:p>
-    <w:p>
-      <w:pPr>
-        <w:pStyle w:val="ListParagraph"/>
-        <w:spacing w:after="0"/>
-        <w:ind w:right="440" w:firstLine="360"/>
-        <w:jc w:val="right"/>
-        <w:rPr>
-          <w:rFonts w:ascii="Faruma" w:hAnsi="Faruma" w:cs="MV Boli"/>
-          <w:rtl/>
-        </w:rPr>
-      </w:pPr>
-      <w:r>
-        <w:rPr>
-          <w:rFonts w:ascii="Faruma" w:hAnsi="Faruma" w:cs="Faruma" w:hint="cs"/>
-          <w:b/>
-          <w:bCs/>
-          <w:rtl/>
-        </w:rPr>
-        <w:t>1</w:t>
-      </w:r>
-      <w:r>
-        <w:rPr>
-          <w:rFonts w:ascii="Faruma" w:hAnsi="Faruma" w:cs="Faruma" w:hint="cs"/>
-          <w:b/>
-          <w:bCs/>
-          <w:rtl/>
-        </w:rPr>
-        <w:t>1</w:t>
-      </w:r>
-      <w:r>
-        <w:rPr>
-          <w:rFonts w:ascii="Faruma" w:hAnsi="Faruma" w:cs="Faruma" w:hint="cs"/>
-          <w:b/>
-          <w:bCs/>
-          <w:rtl/>
-        </w:rPr>
-        <w:t>-</w:t>
-      </w:r>
-      <w:r>
-        <w:rPr>
-          <w:rFonts w:ascii="Faruma" w:hAnsi="Faruma" w:cs="Faruma"/>
-          <w:b/>
-          <w:bCs/>
-          <w:rtl/>
-        </w:rPr>
-        <w:t xml:space="preserve"> </w:t>
-      </w:r>
-      <w:r>
-        <w:rPr>
-          <w:rFonts w:ascii="Faruma" w:hAnsi="Faruma" w:cs="Faruma" w:hint="cs"/>
-          <w:rtl/>
-        </w:rPr>
-        <w:t>ދެވަނަ</w:t>
-      </w:r>
-      <w:r>
-        <w:rPr>
-          <w:rFonts w:ascii="Faruma" w:hAnsi="Faruma" w:cs="Faruma"/>
-          <w:rtl/>
-        </w:rPr>
-        <w:t>ބުރީގެ ކު</w:t>
-      </w:r>
-      <w:r>
-        <w:rPr>
-          <w:rFonts w:ascii="Faruma" w:hAnsi="Faruma" w:cs="Faruma" w:hint="cs"/>
-          <w:rtl/>
-        </w:rPr>
-        <w:t>ނިއާ</w:t>
-      </w:r>
-      <w:r>
-        <w:rPr>
-          <w:rFonts w:ascii="Faruma" w:hAnsi="Faruma" w:cs="Faruma"/>
-          <w:rtl/>
-        </w:rPr>
-        <w:t>އި އަދި މިނޫންވެސް އެބާވަތުގެ އު</w:t>
-      </w:r>
-      <w:r>
-        <w:rPr>
-          <w:rFonts w:ascii="Faruma" w:hAnsi="Faruma" w:cs="Faruma"/>
-          <w:rtl/>
-        </w:rPr>
-        <w:t>ކާ</w:t>
-      </w:r>
-      <w:r>
-        <w:rPr>
-          <w:rFonts w:ascii="Faruma" w:hAnsi="Faruma" w:cs="Faruma"/>
-          <w:rtl/>
-        </w:rPr>
-        <w:t>ލަންޖެހޭ ކުނިވާފަދަ ތަކެތ</w:t>
-      </w:r>
-      <w:r>
-        <w:rPr>
-          <w:rFonts w:ascii="Faruma" w:hAnsi="Faruma" w:cs="Faruma" w:hint="cs"/>
-          <w:rtl/>
-        </w:rPr>
-        <w:t xml:space="preserve">ި ބަހައްޓަންވާނީ ސިޑިގޮޅި ހަޑިނުވާ ގޮތަކަށް، ރަނގަޅަށް ޕެކްކޮފަ، ދެވަނަބުރީގެ ދޮރުކުރިމަތީން ވެމްކޯގެ ޤަވާއިދުތަކާ އެއްގޮތް ވާގޮތުގެމަތިންނެވެ. </w:t>
-      </w:r>
-      <w:r>
-        <w:rPr>
-          <w:rFonts w:ascii="Faruma" w:hAnsi="Faruma" w:cs="Faruma" w:hint="cs"/>
-          <w:rtl/>
-        </w:rPr>
-        <w:t xml:space="preserve">އަދި ކުނިބަހަށްޓާ ސަރަހައްދުގެ ސާފުތާހިރުކަން ބެލެހެއްޓުމަކީ ކުއްޔަށް ހިފިފަރާތުގެ ޒިންމާއެކެވެ. </w:t>
-      </w:r>
-      <w:r>
-        <w:rPr>
-          <w:rFonts w:ascii="Faruma" w:hAnsi="Faruma" w:cs="Faruma" w:hint="cs"/>
-          <w:rtl/>
-        </w:rPr>
-        <w:t>ގުރައުންޑް ފްލޯގެ ގޯޅި ގަނޑުގައި ކުނިބެހެއްޓުމަކީ މަނާ ކަމެކެވެ.</w:t>
-      </w:r>
-    </w:p>
-    <w:p>
-      <w:pPr>
-        <w:pStyle w:val="ListParagraph"/>
-        <w:spacing w:after="0"/>
-        <w:ind w:right="440" w:firstLine="360"/>
-        <w:jc w:val="right"/>
-        <w:rPr>
-          <w:rFonts w:ascii="Faruma" w:hAnsi="Faruma" w:cs="Faruma"/>
-          <w:rtl/>
-        </w:rPr>
-      </w:pPr>
-    </w:p>
-    <w:p>
-      <w:pPr>
-        <w:pStyle w:val="ListParagraph"/>
-        <w:spacing w:after="0"/>
-        <w:ind w:right="440" w:firstLine="360"/>
-        <w:jc w:val="right"/>
-        <w:rPr>
-          <w:rFonts w:ascii="Faruma" w:hAnsi="Faruma" w:cs="Faruma"/>
-          <w:rtl/>
-        </w:rPr>
-      </w:pPr>
-      <w:r>
-        <w:rPr>
-          <w:rFonts w:ascii="Faruma" w:hAnsi="Faruma" w:cs="Faruma" w:hint="cs"/>
-          <w:b/>
-          <w:bCs/>
-          <w:rtl/>
-        </w:rPr>
-        <w:t>1</w:t>
-      </w:r>
-      <w:r>
-        <w:rPr>
-          <w:rFonts w:ascii="Faruma" w:hAnsi="Faruma" w:cs="Faruma" w:hint="cs"/>
-          <w:b/>
-          <w:bCs/>
-          <w:rtl/>
-        </w:rPr>
-        <w:t>2</w:t>
-      </w:r>
-      <w:r>
-        <w:rPr>
-          <w:rFonts w:ascii="Faruma" w:hAnsi="Faruma" w:cs="Faruma" w:hint="cs"/>
-          <w:b/>
-          <w:bCs/>
-          <w:rtl/>
-        </w:rPr>
-        <w:t>-</w:t>
-      </w:r>
-      <w:r>
-        <w:rPr>
-          <w:rFonts w:ascii="Faruma" w:hAnsi="Faruma" w:cs="Faruma"/>
-          <w:b/>
-          <w:bCs/>
-          <w:rtl/>
-        </w:rPr>
-        <w:t xml:space="preserve"> </w:t>
-      </w:r>
-      <w:r>
-        <w:rPr>
-          <w:rFonts w:ascii="Faruma" w:hAnsi="Faruma" w:cs="Faruma"/>
-          <w:rtl/>
-        </w:rPr>
-        <w:t>ކުއްޔަށްހިފި މުއްދަތުގެ ތެރޭގައި އިމާރާތުގައި އިސްލާމްދީނާއި، ދިވެހިރާއްޖޭގެ</w:t>
-      </w:r>
-      <w:r>
-        <w:rPr>
-          <w:rFonts w:ascii="Faruma" w:hAnsi="Faruma" w:cs="Faruma"/>
-          <w:rtl/>
-        </w:rPr>
-        <w:t xml:space="preserve"> ޤާނޫނާއި ޙިލާފު އެއްވެސް ޢަމަލެއް ކުއްޔަށް ހިފިފަރާތުން ހިންގައިފިނަމަ އެކަމެއްގެ ފުރިހަމަ ޒިންމާ، ކުއްޔަށްހިފި ފަރާތުން އުފުލަން ޖެހޭނެއެވެ.</w:t>
-      </w:r>
-    </w:p>
-    <w:p>
-      <w:pPr>
-        <w:pStyle w:val="ListParagraph"/>
-        <w:spacing w:after="0"/>
-        <w:ind w:right="440" w:firstLine="360"/>
-        <w:jc w:val="right"/>
-        <w:rPr>
-          <w:rFonts w:ascii="Faruma" w:hAnsi="Faruma" w:cs="Faruma"/>
-          <w:b/>
-          <w:bCs/>
-          <w:rtl/>
-        </w:rPr>
-      </w:pPr>
-    </w:p>
-    <w:p>
-      <w:pPr>
-        <w:pStyle w:val="ListParagraph"/>
-        <w:spacing w:after="0"/>
-        <w:ind w:right="440" w:firstLine="360"/>
-        <w:jc w:val="right"/>
-        <w:rPr>
-          <w:rFonts w:ascii="Faruma" w:hAnsi="Faruma" w:cs="Faruma"/>
-          <w:rtl/>
-        </w:rPr>
-      </w:pPr>
-      <w:r>
-        <w:rPr>
-          <w:rFonts w:ascii="Faruma" w:hAnsi="Faruma" w:cs="Faruma" w:hint="cs"/>
-          <w:b/>
-          <w:bCs/>
-          <w:rtl/>
-        </w:rPr>
-        <w:t>1</w:t>
-      </w:r>
-      <w:r>
-        <w:rPr>
-          <w:rFonts w:ascii="Faruma" w:hAnsi="Faruma" w:cs="Faruma" w:hint="cs"/>
-          <w:b/>
-          <w:bCs/>
-          <w:rtl/>
-        </w:rPr>
-        <w:t>3</w:t>
-      </w:r>
-      <w:r>
-        <w:rPr>
-          <w:rFonts w:ascii="Faruma" w:hAnsi="Faruma" w:cs="Faruma" w:hint="cs"/>
-          <w:b/>
-          <w:bCs/>
-          <w:rtl/>
-        </w:rPr>
-        <w:t>-</w:t>
-      </w:r>
-      <w:r>
-        <w:rPr>
-          <w:rFonts w:ascii="Faruma" w:hAnsi="Faruma" w:cs="Faruma"/>
-          <w:b/>
-          <w:bCs/>
-          <w:rtl/>
-        </w:rPr>
-        <w:t xml:space="preserve"> </w:t>
-      </w:r>
-      <w:r>
-        <w:rPr>
-          <w:rFonts w:ascii="Faruma" w:hAnsi="Faruma" w:cs="Faruma"/>
-          <w:rtl/>
-        </w:rPr>
-        <w:t>ކުއްޔަށްހިފި</w:t>
-      </w:r>
-      <w:r>
-        <w:rPr>
-          <w:rFonts w:ascii="Faruma" w:hAnsi="Faruma" w:cs="Faruma"/>
-          <w:rtl/>
-        </w:rPr>
-        <w:t xml:space="preserve"> ފަރާތުން އެހެން ފަރާތަކަށް </w:t>
-      </w:r>
-      <w:r>
-        <w:rPr>
-          <w:rFonts w:ascii="Faruma" w:hAnsi="Faruma" w:cs="Faruma" w:hint="cs"/>
-          <w:rtl/>
-        </w:rPr>
-        <w:t>ދެވަނަ</w:t>
-      </w:r>
-      <w:r>
-        <w:rPr>
-          <w:rFonts w:ascii="Faruma" w:hAnsi="Faruma" w:cs="Faruma"/>
-          <w:rtl/>
-        </w:rPr>
-        <w:t>ބުރި ކުއްޔަށް</w:t>
-      </w:r>
-      <w:r>
-        <w:rPr>
-          <w:rFonts w:ascii="Faruma" w:hAnsi="Faruma" w:cs="Faruma" w:hint="cs"/>
-          <w:rtl/>
-        </w:rPr>
-        <w:t>ދިނުމަކީ މަނާ ކަމެކެވެ.</w:t>
-      </w:r>
-    </w:p>
-    <w:p>
-      <w:pPr>
-        <w:pStyle w:val="ListParagraph"/>
-        <w:spacing w:after="0"/>
-        <w:ind w:right="440" w:firstLine="360"/>
-        <w:jc w:val="right"/>
-        <w:rPr>
-          <w:rFonts w:ascii="Faruma" w:hAnsi="Faruma" w:cs="Faruma"/>
-          <w:b/>
-          <w:bCs/>
-          <w:rtl/>
-        </w:rPr>
-      </w:pPr>
-    </w:p>
-    <w:p>
-      <w:pPr>
-        <w:pStyle w:val="ListParagraph"/>
-        <w:spacing w:after="0"/>
-        <w:ind w:right="440" w:firstLine="360"/>
-        <w:jc w:val="right"/>
-        <w:rPr>
-          <w:rFonts w:ascii="Faruma" w:hAnsi="Faruma" w:cs="Faruma"/>
-          <w:rtl/>
-        </w:rPr>
-      </w:pPr>
-      <w:r>
-        <w:rPr>
-          <w:rFonts w:ascii="Faruma" w:hAnsi="Faruma" w:cs="Faruma" w:hint="cs"/>
-          <w:b/>
-          <w:bCs/>
-          <w:rtl/>
-        </w:rPr>
-        <w:t>1</w:t>
-      </w:r>
-      <w:r>
-        <w:rPr>
-          <w:rFonts w:ascii="Faruma" w:hAnsi="Faruma" w:cs="Faruma" w:hint="cs"/>
-          <w:b/>
-          <w:bCs/>
-          <w:rtl/>
-        </w:rPr>
-        <w:t>4</w:t>
-      </w:r>
-      <w:r>
-        <w:rPr>
-          <w:rFonts w:ascii="Faruma" w:hAnsi="Faruma" w:cs="Faruma" w:hint="cs"/>
-          <w:b/>
-          <w:bCs/>
-          <w:rtl/>
-        </w:rPr>
-        <w:t>-</w:t>
-      </w:r>
-      <w:r>
-        <w:rPr>
-          <w:rFonts w:ascii="Faruma" w:hAnsi="Faruma" w:cs="Faruma"/>
-          <w:b/>
-          <w:bCs/>
-          <w:rtl/>
-        </w:rPr>
-        <w:t xml:space="preserve"> </w:t>
-      </w:r>
-      <w:r>
-        <w:rPr>
-          <w:rFonts w:ascii="Faruma" w:hAnsi="Faruma" w:cs="Faruma"/>
-          <w:rtl/>
-        </w:rPr>
-        <w:t>ކުއްޔަށްހިފި ފަރާތުން އެޕާޓްމަންޓް ދޫކޮށްލާނަމަ، ދެމަސް ދުވަސް ކުރިން ވެރިފަރާތައް އެކަން އ</w:t>
-      </w:r>
-      <w:r>
-        <w:rPr>
-          <w:rFonts w:ascii="Faruma" w:hAnsi="Faruma" w:cs="Faruma"/>
-          <w:rtl/>
-        </w:rPr>
-        <w:t>ަ</w:t>
-      </w:r>
-      <w:r>
-        <w:rPr>
-          <w:rFonts w:ascii="Faruma" w:hAnsi="Faruma" w:cs="Faruma"/>
-          <w:rtl/>
-        </w:rPr>
-        <w:t xml:space="preserve">ންގަންވާނެއެވެ. </w:t>
-      </w:r>
-    </w:p>
-    <w:p>
-      <w:pPr>
-        <w:spacing w:after="0"/>
-        <w:ind w:right="880"/>
-        <w:rPr>
-          <w:rFonts w:ascii="Faruma" w:hAnsi="Faruma" w:cs="Faruma"/>
-          <w:rtl/>
-        </w:rPr>
-      </w:pPr>
-    </w:p>
-    <w:p>
-      <w:pPr>
-        <w:pStyle w:val="ListParagraph"/>
-        <w:spacing w:after="0"/>
-        <w:ind w:right="440" w:firstLine="360"/>
-        <w:jc w:val="right"/>
-        <w:rPr>
-          <w:rFonts w:ascii="Faruma" w:hAnsi="Faruma" w:cs="Faruma"/>
-          <w:rtl/>
-        </w:rPr>
-      </w:pPr>
-      <w:r>
-        <w:rPr>
-          <w:rFonts w:ascii="Faruma" w:hAnsi="Faruma" w:cs="Faruma" w:hint="cs"/>
-          <w:b/>
-          <w:bCs/>
-          <w:rtl/>
-        </w:rPr>
-        <w:t>1</w:t>
-      </w:r>
-      <w:r>
-        <w:rPr>
-          <w:rFonts w:ascii="Faruma" w:hAnsi="Faruma" w:cs="Faruma" w:hint="cs"/>
-          <w:b/>
-          <w:bCs/>
-          <w:rtl/>
-        </w:rPr>
-        <w:t>5</w:t>
-      </w:r>
-      <w:r>
-        <w:rPr>
-          <w:rFonts w:ascii="Faruma" w:hAnsi="Faruma" w:cs="Faruma" w:hint="cs"/>
-          <w:b/>
-          <w:bCs/>
-          <w:rtl/>
-        </w:rPr>
-        <w:t>-</w:t>
-      </w:r>
-      <w:r>
-        <w:rPr>
-          <w:rFonts w:ascii="Faruma" w:hAnsi="Faruma" w:cs="Faruma"/>
-          <w:b/>
-          <w:bCs/>
-          <w:rtl/>
-        </w:rPr>
-        <w:t xml:space="preserve"> </w:t>
-      </w:r>
-      <w:r>
-        <w:rPr>
-          <w:rFonts w:ascii="Faruma" w:hAnsi="Faruma" w:cs="Faruma"/>
-          <w:rtl/>
-        </w:rPr>
-        <w:t>މިއެގްރިމަންޓްގައި އެއްބަސްވެފަ</w:t>
-      </w:r>
-      <w:r>
-        <w:rPr>
-          <w:rFonts w:ascii="Faruma" w:hAnsi="Faruma" w:cs="Faruma"/>
-          <w:rtl/>
-        </w:rPr>
-        <w:t>އި</w:t>
-      </w:r>
-      <w:r>
-        <w:rPr>
-          <w:rFonts w:ascii="Faruma" w:hAnsi="Faruma" w:cs="Faruma"/>
-          <w:rtl/>
-        </w:rPr>
-        <w:t>ވާ ކަމެއްގެ އިތުރުން އެއްވެސް މައްސަލައެއް ދިމާވެއްޖެ ނަމަ އެ މައްސްލައެއް ފުރަތަމަ ޙައްލު ކުރާނީ ދެފަރާތް ވާހަކަދައްކާ ސުލްހަވެރިކޮށެވެ. އަދި މިގޮތުން އެމައްސަލައެއް ޙައްލު ނުވެއްޖެނަމަ ދެން އެމައަސަލައެއް ޙައްލުކުރާނީ ކަމާބެހޭ ފަރާތެއް މެދުވެރިކޮށެވެ.</w:t>
-      </w:r>
-    </w:p>
-    <w:p>
-      <w:pPr>
-        <w:pStyle w:val="ListParagraph"/>
-        <w:spacing w:after="0"/>
-        <w:ind w:right="440" w:firstLine="360"/>
-        <w:jc w:val="right"/>
-        <w:rPr>
-          <w:rFonts w:ascii="Faruma" w:hAnsi="Faruma" w:cs="Faruma"/>
-          <w:rtl/>
-        </w:rPr>
-      </w:pPr>
-    </w:p>
-    <w:p>
-      <w:pPr>
-        <w:pStyle w:val="ListParagraph"/>
-        <w:spacing w:after="0"/>
-        <w:ind w:right="440" w:firstLine="360"/>
-        <w:jc w:val="right"/>
-        <w:rPr>
-          <w:rFonts w:ascii="Faruma" w:hAnsi="Faruma" w:cs="Faruma"/>
-          <w:rtl/>
-        </w:rPr>
-      </w:pPr>
-      <w:r>
-        <w:rPr>
-          <w:rFonts w:ascii="Faruma" w:hAnsi="Faruma" w:cs="Faruma" w:hint="cs"/>
-          <w:b/>
-          <w:bCs/>
-          <w:rtl/>
-        </w:rPr>
-        <w:t>1</w:t>
-      </w:r>
-      <w:r>
-        <w:rPr>
-          <w:rFonts w:ascii="Faruma" w:hAnsi="Faruma" w:cs="Faruma" w:hint="cs"/>
-          <w:b/>
-          <w:bCs/>
-          <w:rtl/>
-        </w:rPr>
-        <w:t>6</w:t>
-      </w:r>
-      <w:r>
-        <w:rPr>
-          <w:rFonts w:ascii="Faruma" w:hAnsi="Faruma" w:cs="Faruma" w:hint="cs"/>
-          <w:b/>
-          <w:bCs/>
-          <w:rtl/>
-        </w:rPr>
-        <w:t>-</w:t>
-      </w:r>
-      <w:r>
-        <w:rPr>
-          <w:rFonts w:ascii="Faruma" w:hAnsi="Faruma" w:cs="Faruma"/>
-          <w:b/>
-          <w:bCs/>
-          <w:rtl/>
-        </w:rPr>
-        <w:t xml:space="preserve"> </w:t>
-      </w:r>
-      <w:r>
-        <w:rPr>
-          <w:rFonts w:ascii="Faruma" w:hAnsi="Faruma" w:cs="Faruma"/>
-          <w:rtl/>
-        </w:rPr>
-        <w:t xml:space="preserve">މިއެގްރިމެންޓްގެ މުއްދަތު </w:t>
-      </w:r>
-      <w:r>
-        <w:rPr>
-          <w:rFonts w:ascii="Faruma" w:hAnsi="Faruma" w:cs="Faruma"/>
-          <w:rtl/>
-        </w:rPr>
-        <w:t xml:space="preserve">ހަމަވުމަށްފަލު ވެރިފަރާތުން </w:t>
-      </w:r>
-      <w:r>
-        <w:rPr>
-          <w:rFonts w:ascii="Faruma" w:hAnsi="Faruma" w:cs="Faruma" w:hint="cs"/>
-          <w:rtl/>
-        </w:rPr>
-        <w:t>ދެވަނަ</w:t>
-      </w:r>
-      <w:r>
-        <w:rPr>
-          <w:rFonts w:ascii="Faruma" w:hAnsi="Faruma" w:cs="Faruma"/>
-          <w:rtl/>
-        </w:rPr>
-        <w:t>ބުރި އެއްވެސް ފަރާތަކަށް ކުއްޔަށް ދޭނަމަ، ކުއްޔަށ</w:t>
-      </w:r>
-      <w:r>
-        <w:rPr>
-          <w:rFonts w:ascii="Faruma" w:hAnsi="Faruma" w:cs="Faruma"/>
-          <w:rtl/>
-        </w:rPr>
-        <w:t>ް</w:t>
-      </w:r>
-      <w:r>
-        <w:rPr>
-          <w:rFonts w:ascii="Faruma" w:hAnsi="Faruma" w:cs="Faruma"/>
-          <w:rtl/>
-        </w:rPr>
-        <w:t xml:space="preserve"> ހިފި ފަރާތަށް އިސްކަންދޭންވާނެއެވެ.</w:t>
-      </w:r>
-    </w:p>
-    <w:p>
-      <w:pPr>
-        <w:pStyle w:val="ListParagraph"/>
-        <w:spacing w:after="0"/>
-        <w:ind w:right="440" w:firstLine="360"/>
-        <w:jc w:val="right"/>
-        <w:rPr>
-          <w:rFonts w:ascii="Faruma" w:hAnsi="Faruma" w:cs="Faruma"/>
-          <w:rtl/>
-        </w:rPr>
-      </w:pPr>
-    </w:p>
-    <w:p>
-      <w:pPr>
-        <w:pStyle w:val="ListParagraph"/>
-        <w:spacing w:after="0"/>
-        <w:ind w:right="440" w:firstLine="360"/>
-        <w:jc w:val="right"/>
-        <w:rPr>
-          <w:rFonts w:ascii="Faruma" w:hAnsi="Faruma" w:cs="Faruma"/>
-          <w:rtl/>
-        </w:rPr>
-      </w:pPr>
-      <w:r>
-        <w:rPr>
-          <w:rFonts w:ascii="Faruma" w:hAnsi="Faruma" w:cs="Faruma" w:hint="cs"/>
-          <w:b/>
-          <w:bCs/>
-          <w:rtl/>
-        </w:rPr>
-        <w:t>1</w:t>
-      </w:r>
-      <w:r>
-        <w:rPr>
-          <w:rFonts w:ascii="Faruma" w:hAnsi="Faruma" w:cs="Faruma" w:hint="cs"/>
-          <w:b/>
-          <w:bCs/>
-          <w:rtl/>
-        </w:rPr>
-        <w:t>7</w:t>
-      </w:r>
-      <w:r>
-        <w:rPr>
-          <w:rFonts w:ascii="Faruma" w:hAnsi="Faruma" w:cs="Faruma" w:hint="cs"/>
-          <w:b/>
-          <w:bCs/>
-          <w:rtl/>
-        </w:rPr>
-        <w:t>-</w:t>
-      </w:r>
-      <w:r>
-        <w:rPr>
-          <w:rFonts w:ascii="Faruma" w:hAnsi="Faruma" w:cs="Faruma"/>
-          <w:b/>
-          <w:bCs/>
-          <w:rtl/>
-        </w:rPr>
-        <w:t xml:space="preserve"> </w:t>
-      </w:r>
-      <w:r>
-        <w:rPr>
-          <w:rFonts w:ascii="Faruma" w:hAnsi="Faruma" w:cs="Faruma"/>
-          <w:rtl/>
-        </w:rPr>
-        <w:t xml:space="preserve">މި އެގްރިމަންޓްގެ </w:t>
-      </w:r>
-      <w:r>
-        <w:rPr>
-          <w:rFonts w:ascii="Faruma" w:hAnsi="Faruma" w:cs="Faruma" w:hint="cs"/>
-          <w:rtl/>
-        </w:rPr>
-        <w:t>ހަތަރުވަނަ</w:t>
-      </w:r>
-      <w:r>
-        <w:rPr>
-          <w:rFonts w:ascii="Faruma" w:hAnsi="Faruma" w:cs="Faruma"/>
-          <w:rtl/>
-        </w:rPr>
-        <w:t>ވަނަ މާއްދާގައި އެއްބަސްވެފައިވާ ކުލި، ކުއްޔަށް ހިފިފަރާތުން މި އެގްރިމަންޓްގެ ހަވަނަ މ</w:t>
-      </w:r>
-      <w:r>
-        <w:rPr>
-          <w:rFonts w:ascii="Faruma" w:hAnsi="Faruma" w:cs="Faruma"/>
-          <w:rtl/>
-        </w:rPr>
-        <w:t>ާއްދާއާއި އެއްގޮތައް ނުދައްކައިފި ނަމަ، މި އެގްރިމަންޓް ބާތިލުކުރުމުގެ ފުރިހަމަ އިޙްތިޔާރު ވެރިފަރާތަށް ލިބިގެންވެއެވެ.</w:t>
-      </w:r>
-    </w:p>
-    <w:p>
-      <w:pPr>
-        <w:pStyle w:val="ListParagraph"/>
-        <w:spacing w:after="0"/>
-        <w:ind w:right="440" w:firstLine="360"/>
-        <w:jc w:val="right"/>
-        <w:rPr>
-          <w:rFonts w:ascii="Faruma" w:hAnsi="Faruma" w:cs="Faruma"/>
-          <w:rtl/>
-        </w:rPr>
-      </w:pPr>
-    </w:p>
-    <w:p>
-      <w:pPr>
-        <w:pStyle w:val="ListParagraph"/>
-        <w:spacing w:after="0"/>
-        <w:ind w:right="440" w:firstLine="360"/>
-        <w:jc w:val="right"/>
-        <w:rPr>
-          <w:rFonts w:ascii="Faruma" w:hAnsi="Faruma" w:cs="Faruma"/>
-          <w:rtl/>
-        </w:rPr>
-      </w:pPr>
-      <w:r>
-        <w:rPr>
-          <w:rFonts w:ascii="Faruma" w:hAnsi="Faruma" w:cs="Faruma" w:hint="cs"/>
-          <w:b/>
-          <w:bCs/>
-          <w:rtl/>
-        </w:rPr>
-        <w:t>1</w:t>
-      </w:r>
-      <w:r>
-        <w:rPr>
-          <w:rFonts w:ascii="Faruma" w:hAnsi="Faruma" w:cs="Faruma" w:hint="cs"/>
-          <w:b/>
-          <w:bCs/>
-          <w:rtl/>
-        </w:rPr>
-        <w:t>8</w:t>
-      </w:r>
-      <w:r>
-        <w:rPr>
-          <w:rFonts w:ascii="Faruma" w:hAnsi="Faruma" w:cs="Faruma" w:hint="cs"/>
-          <w:b/>
-          <w:bCs/>
-          <w:rtl/>
-        </w:rPr>
-        <w:t>-</w:t>
-      </w:r>
-      <w:r>
-        <w:rPr>
-          <w:rFonts w:ascii="Faruma" w:hAnsi="Faruma" w:cs="Faruma"/>
-          <w:b/>
-          <w:bCs/>
-          <w:rtl/>
-        </w:rPr>
-        <w:t xml:space="preserve"> </w:t>
-      </w:r>
-      <w:r>
-        <w:rPr>
-          <w:rFonts w:ascii="Faruma" w:hAnsi="Faruma" w:cs="Faruma"/>
-          <w:rtl/>
-        </w:rPr>
-        <w:t>މި އެގްރިމަންޓްގެ ސަތާ</w:t>
-      </w:r>
-      <w:r>
-        <w:rPr>
-          <w:rFonts w:ascii="Faruma" w:hAnsi="Faruma" w:cs="Faruma"/>
-          <w:rtl/>
-        </w:rPr>
-        <w:t>ރަވަނަ މާއްދާގެ ދަށުން މި އެގްރިމަންޓް ބާތިލް ކުރިނަމ</w:t>
-      </w:r>
-      <w:r>
-        <w:rPr>
-          <w:rFonts w:ascii="Faruma" w:hAnsi="Faruma" w:cs="Faruma"/>
-          <w:rtl/>
-        </w:rPr>
-        <w:t xml:space="preserve">ަވެސް، ކުއްޔަށްހިފި </w:t>
-      </w:r>
-      <w:r>
-        <w:rPr>
-          <w:rFonts w:ascii="Faruma" w:hAnsi="Faruma" w:cs="Faruma"/>
-          <w:rtl/>
-        </w:rPr>
-        <w:t xml:space="preserve">ފަރާތުން </w:t>
-      </w:r>
-      <w:r>
-        <w:rPr>
-          <w:rFonts w:ascii="Faruma" w:hAnsi="Faruma" w:cs="Faruma" w:hint="cs"/>
-          <w:rtl/>
-        </w:rPr>
-        <w:t>ދެވަނަ</w:t>
-      </w:r>
-      <w:r>
-        <w:rPr>
-          <w:rFonts w:ascii="Faruma" w:hAnsi="Faruma" w:cs="Faruma"/>
-          <w:rtl/>
-        </w:rPr>
-        <w:t xml:space="preserve">ބުރި ބޭނުންކުރި މުއްދަތަށް ވެރިފަރާތައް މިއެގްރިމަންޓްގެ </w:t>
-      </w:r>
-      <w:r>
-        <w:rPr>
-          <w:rFonts w:ascii="Faruma" w:hAnsi="Faruma" w:cs="Faruma"/>
-          <w:rtl/>
-        </w:rPr>
-        <w:t>ދެވަނަ</w:t>
-      </w:r>
-      <w:r>
-        <w:rPr>
-          <w:rFonts w:ascii="Faruma" w:hAnsi="Faruma" w:cs="Faruma"/>
-          <w:rtl/>
-        </w:rPr>
-        <w:t xml:space="preserve"> މާއްދާގައި އެއްބަސްވި ކުލި ދައްކަން ޖެހޭނެއެވެ. އަދި ކުއްޔަށްހިފި</w:t>
-      </w:r>
-      <w:r>
-        <w:rPr>
-          <w:rFonts w:ascii="Faruma" w:hAnsi="Faruma" w:cs="Faruma"/>
-          <w:rtl/>
-        </w:rPr>
-        <w:t xml:space="preserve"> ފަރާތުގެ ސަބަބުން އިމާރާތަށާއި </w:t>
-      </w:r>
-      <w:r>
-        <w:rPr>
-          <w:rFonts w:ascii="Faruma" w:hAnsi="Faruma" w:cs="Faruma" w:hint="cs"/>
-          <w:rtl/>
-        </w:rPr>
-        <w:t>ދެ</w:t>
-      </w:r>
-      <w:r>
-        <w:rPr>
-          <w:rFonts w:ascii="Faruma" w:hAnsi="Faruma" w:cs="Faruma"/>
-          <w:rtl/>
-        </w:rPr>
-        <w:t>ވަނަބުރި (އެޕާޓްމަންޓް) އަށް އެއްވެސް ގެއްލުމެއް ލިބިފައި ހުރިނަމަ އެކަމުގެ ޒިންމާ އުފުލުމައްފަހު، ކުއްޔަށްހިފި ފަރާތުން ވެރިފަރާތައް ބަދަލުދިނުމަށް އެއްބަސްވެއެވެ.</w:t>
-      </w:r>
-    </w:p>
-    <w:p>
-      <w:pPr>
-        <w:pStyle w:val="ListParagraph"/>
-        <w:spacing w:after="0"/>
-        <w:ind w:right="440" w:firstLine="360"/>
-        <w:jc w:val="right"/>
-        <w:rPr>
-          <w:rFonts w:ascii="Faruma" w:hAnsi="Faruma" w:cs="Faruma"/>
-          <w:rtl/>
-        </w:rPr>
-      </w:pPr>
-    </w:p>
-    <w:p>
-      <w:pPr>
-        <w:pStyle w:val="ListParagraph"/>
-        <w:spacing w:after="0"/>
-        <w:ind w:right="440" w:firstLine="360"/>
-        <w:jc w:val="right"/>
-        <w:rPr>
-          <w:rFonts w:ascii="Faruma" w:hAnsi="Faruma" w:cs="Faruma"/>
-        </w:rPr>
-      </w:pPr>
-      <w:r>
-        <w:rPr>
-          <w:rFonts w:ascii="Faruma" w:hAnsi="Faruma" w:cs="Faruma" w:hint="cs"/>
-          <w:b/>
-          <w:bCs/>
-          <w:rtl/>
-        </w:rPr>
-        <w:lastRenderedPageBreak/>
-        <w:t>1</w:t>
-      </w:r>
-      <w:r>
-        <w:rPr>
-          <w:rFonts w:ascii="Faruma" w:hAnsi="Faruma" w:cs="Faruma" w:hint="cs"/>
-          <w:b/>
-          <w:bCs/>
-          <w:rtl/>
-        </w:rPr>
-        <w:t>9</w:t>
-      </w:r>
-      <w:r>
-        <w:rPr>
-          <w:rFonts w:ascii="Faruma" w:hAnsi="Faruma" w:cs="Faruma" w:hint="cs"/>
-          <w:b/>
-          <w:bCs/>
-          <w:rtl/>
-        </w:rPr>
-        <w:t>-</w:t>
-      </w:r>
-      <w:r>
-        <w:rPr>
-          <w:rFonts w:ascii="Faruma" w:hAnsi="Faruma" w:cs="Faruma"/>
-          <w:b/>
-          <w:bCs/>
-          <w:rtl/>
-        </w:rPr>
-        <w:t xml:space="preserve"> </w:t>
-      </w:r>
-      <w:r>
-        <w:rPr>
-          <w:rFonts w:ascii="Faruma" w:hAnsi="Faruma" w:cs="Faruma"/>
-          <w:rtl/>
-        </w:rPr>
-        <w:t>ވެރިފަރާތް ނުވަތަ ކުއްޔަށްހިފި ފަރާތުންކުރެ ފަރާތެއް ނުވަތަ ދެފަރާތުންކުރެ އެއްވެސް</w:t>
-      </w:r>
-      <w:r>
-        <w:rPr>
-          <w:rFonts w:ascii="Faruma" w:hAnsi="Faruma" w:cs="Faruma"/>
-          <w:rtl/>
-        </w:rPr>
-        <w:t>ފަރާތެއް ދުނިޔޭގައި ނެތިއްޖެނަމަ</w:t>
-      </w:r>
-      <w:r>
-        <w:rPr>
-          <w:rFonts w:ascii="Faruma" w:hAnsi="Faruma" w:cs="Times New Roman"/>
-          <w:rtl/>
-        </w:rPr>
-        <w:t>،</w:t>
-      </w:r>
-      <w:r>
-        <w:rPr>
-          <w:rFonts w:ascii="Faruma" w:hAnsi="Faruma" w:cs="Faruma"/>
-          <w:rtl/>
-        </w:rPr>
-        <w:t xml:space="preserve"> ވެރިފަރާތާއި ކުއްޔަށްހިފި ފަރާތުގެ ވާރިސުންނަށް</w:t>
-      </w:r>
-      <w:r>
-        <w:rPr>
-          <w:rFonts w:ascii="Faruma" w:hAnsi="Faruma" w:cs="Faruma"/>
-          <w:rtl/>
-        </w:rPr>
-        <w:t xml:space="preserve"> މި އެގްރިމަންޓްއަށް ޢަމަލުކުރު</w:t>
-      </w:r>
-      <w:r>
-        <w:rPr>
-          <w:rFonts w:ascii="Faruma" w:hAnsi="Faruma" w:cs="Faruma"/>
-          <w:rtl/>
-        </w:rPr>
-        <w:t>މަށް ވަސީޢަތްކުރަމެވެ.</w:t>
-      </w:r>
-    </w:p>
-    <w:p>
-      <w:pPr>
-        <w:pStyle w:val="ListParagraph"/>
-        <w:spacing w:after="0"/>
-        <w:ind w:right="440" w:firstLine="360"/>
-        <w:jc w:val="right"/>
-        <w:rPr>
-          <w:rFonts w:ascii="Faruma" w:hAnsi="Faruma" w:cs="Faruma"/>
-          <w:rtl/>
-        </w:rPr>
-      </w:pPr>
-    </w:p>
-    <w:p>
-      <w:pPr>
-        <w:pStyle w:val="ListParagraph"/>
-        <w:spacing w:after="0"/>
-        <w:ind w:right="440" w:firstLine="360"/>
-        <w:jc w:val="right"/>
-        <w:rPr>
-          <w:rFonts w:ascii="Faruma" w:hAnsi="Faruma" w:cs="Faruma"/>
-          <w:rtl/>
-        </w:rPr>
-      </w:pPr>
-    </w:p>
-    <w:p>
-      <w:pPr>
-        <w:pStyle w:val="ListParagraph"/>
-        <w:spacing w:after="0"/>
-        <w:ind w:right="440" w:firstLine="360"/>
-        <w:jc w:val="right"/>
-        <w:rPr>
-          <w:rFonts w:ascii="Faruma" w:hAnsi="Faruma" w:cs="Faruma"/>
-          <w:rtl/>
-        </w:rPr>
-      </w:pPr>
-    </w:p>
-    <w:p>
-      <w:pPr>
-        <w:pStyle w:val="ListParagraph"/>
-        <w:spacing w:after="0"/>
-        <w:ind w:right="440" w:firstLine="360"/>
-        <w:jc w:val="right"/>
-        <w:rPr>
-          <w:rFonts w:ascii="Faruma" w:hAnsi="Faruma" w:cs="Faruma"/>
-          <w:rtl/>
-        </w:rPr>
-      </w:pPr>
-      <w:r>
-        <w:rPr>
-          <w:rFonts w:ascii="Faruma" w:hAnsi="Faruma" w:cs="Faruma" w:hint="cs"/>
-          <w:b/>
-          <w:bCs/>
-          <w:rtl/>
-        </w:rPr>
         <w:t>20</w:t>
       </w:r>
       <w:r>
@@ -2617,17 +2758,20 @@
           <w:b/>
           <w:bCs/>
           <w:u w:val="single"/>
-        </w:rPr>
-      </w:pPr>
-      <w:r>
-        <w:rPr>
-          <w:rFonts w:ascii="Faruma" w:hAnsi="Faruma" w:cs="Faruma" w:hint="cs"/>
-          <w:b/>
-          <w:bCs/>
+          <w:lang w:bidi="dv-MV"/>
+        </w:rPr>
+      </w:pPr>
+      <w:r>
+        <w:rPr>
+          <w:rFonts w:ascii="Faruma" w:hAnsi="Faruma" w:cs="Faruma" w:hint="cs"/>
+          <w:b/>
+          <w:bCs/>
+          <w:color w:val="EE0000"/>
           <w:u w:val="single"/>
           <w:rtl/>
-        </w:rPr>
-        <w:t>މެއި 06 2026</w:t>
+          <w:lang w:bidi="dv-MV"/>
+        </w:rPr>
+        <w:t>އެގްރީމަންޓްފެށޭތާރީހް</w:t>
       </w:r>
       <w:r>
         <w:rPr>
@@ -2637,16 +2781,51 @@
           <w:u w:val="single"/>
           <w:rtl/>
         </w:rPr>
-        <w:t xml:space="preserve"> ފެށިގެން ނިޔަލަށްވާ</w:t>
-      </w:r>
-      <w:r>
-        <w:rPr>
-          <w:rFonts w:ascii="Faruma" w:hAnsi="Faruma" w:cs="Faruma" w:hint="cs"/>
-          <w:b/>
-          <w:bCs/>
+        <w:t xml:space="preserve"> </w:t>
+      </w:r>
+      <w:r>
+        <w:rPr>
+          <w:rFonts w:ascii="Faruma" w:hAnsi="Faruma" w:cs="Faruma" w:hint="cs"/>
+          <w:b/>
+          <w:bCs/>
+          <w:color w:val="2E74B5" w:themeColor="accent1" w:themeShade="BF"/>
           <w:u w:val="single"/>
           <w:rtl/>
         </w:rPr>
+        <w:t>ފެށިގެން</w:t>
+      </w:r>
+      <w:r>
+        <w:rPr>
+          <w:rFonts w:ascii="Faruma" w:hAnsi="Faruma" w:cs="Faruma" w:hint="cs"/>
+          <w:b/>
+          <w:bCs/>
+          <w:color w:val="2E74B5" w:themeColor="accent1" w:themeShade="BF"/>
+          <w:u w:val="single"/>
+          <w:rtl/>
+          <w:lang w:bidi="dv-MV"/>
+        </w:rPr>
+        <w:t xml:space="preserve"> </w:t>
+      </w:r>
+      <w:r>
+        <w:rPr>
+          <w:rFonts w:ascii="Faruma" w:hAnsi="Faruma" w:cs="Faruma" w:hint="cs"/>
+          <w:b/>
+          <w:bCs/>
+          <w:color w:val="2E74B5" w:themeColor="accent1" w:themeShade="BF"/>
+          <w:u w:val="single"/>
+          <w:rtl/>
+        </w:rPr>
+        <w:t>ނިޔަލަށްވާ</w:t>
+      </w:r>
+      <w:r>
+        <w:rPr>
+          <w:rFonts w:ascii="Faruma" w:hAnsi="Faruma" w:cs="Faruma" w:hint="cs"/>
+          <w:b/>
+          <w:bCs/>
+          <w:color w:val="2E74B5" w:themeColor="accent1" w:themeShade="BF"/>
+          <w:u w:val="single"/>
+          <w:rtl/>
+        </w:rPr>
         <w:t xml:space="preserve"> -/8،333.33</w:t>
       </w:r>
       <w:r>
@@ -2654,6 +2833,7 @@
           <w:rFonts w:ascii="Faruma" w:hAnsi="Faruma" w:cs="Faruma" w:hint="cs"/>
           <w:b/>
           <w:bCs/>
+          <w:color w:val="2E74B5" w:themeColor="accent1" w:themeShade="BF"/>
           <w:u w:val="single"/>
           <w:rtl/>
         </w:rPr>
@@ -2664,6 +2844,7 @@
           <w:rFonts w:ascii="Faruma" w:hAnsi="Faruma" w:cs="Faruma" w:hint="cs"/>
           <w:b/>
           <w:bCs/>
+          <w:color w:val="2E74B5" w:themeColor="accent1" w:themeShade="BF"/>
           <w:u w:val="single"/>
           <w:rtl/>
         </w:rPr>
@@ -2674,6 +2855,7 @@
           <w:rFonts w:ascii="Faruma" w:hAnsi="Faruma" w:cs="Faruma" w:hint="cs"/>
           <w:b/>
           <w:bCs/>
+          <w:color w:val="2E74B5" w:themeColor="accent1" w:themeShade="BF"/>
           <w:u w:val="single"/>
           <w:rtl/>
         </w:rPr>
@@ -2684,6 +2866,7 @@
           <w:rFonts w:ascii="Faruma" w:hAnsi="Faruma" w:cs="Faruma" w:hint="cs"/>
           <w:b/>
           <w:bCs/>
+          <w:color w:val="2E74B5" w:themeColor="accent1" w:themeShade="BF"/>
           <w:u w:val="single"/>
           <w:rtl/>
         </w:rPr>
@@ -2694,6 +2877,7 @@
           <w:rFonts w:ascii="Faruma" w:hAnsi="Faruma" w:cs="Faruma" w:hint="cs"/>
           <w:b/>
           <w:bCs/>
+          <w:color w:val="2E74B5" w:themeColor="accent1" w:themeShade="BF"/>
           <w:u w:val="single"/>
           <w:rtl/>
         </w:rPr>
@@ -2704,6 +2888,7 @@
           <w:rFonts w:ascii="Faruma" w:hAnsi="Faruma" w:cs="Faruma" w:hint="cs"/>
           <w:b/>
           <w:bCs/>
+          <w:color w:val="2E74B5" w:themeColor="accent1" w:themeShade="BF"/>
           <w:u w:val="single"/>
           <w:rtl/>
         </w:rPr>
@@ -2714,10 +2899,11 @@
           <w:rFonts w:ascii="Faruma" w:hAnsi="Faruma" w:cs="Faruma" w:hint="cs"/>
           <w:b/>
           <w:bCs/>
+          <w:color w:val="2E74B5" w:themeColor="accent1" w:themeShade="BF"/>
           <w:u w:val="single"/>
           <w:rtl/>
         </w:rPr>
-        <w:t xml:space="preserve"> އަދި ސެކިއުރިޓީ ޑިޕޮސިޓް -/10،000 (ދިހަހާސް ރުފިޔާ)</w:t>
+        <w:t xml:space="preserve"> އަދި ސެކިއުރިޓީ ޑިޕޮސިޓް</w:t>
       </w:r>
       <w:r>
         <w:rPr>
@@ -2727,39 +2913,72 @@
           <w:u w:val="single"/>
           <w:rtl/>
         </w:rPr>
-        <w:t xml:space="preserve"> ވަނީ ލިބިފައެވެ.</w:t>
-      </w:r>
-    </w:p>
-    <w:p>
-      <w:pPr>
-        <w:rPr>
-          <w:rFonts w:ascii="Faruma" w:hAnsi="Faruma" w:cs="Faruma"/>
-          <w:rtl/>
-        </w:rPr>
-      </w:pPr>
-    </w:p>
-    <w:p>
-      <w:pPr>
-        <w:pStyle w:val="ListParagraph"/>
-        <w:spacing w:after="0"/>
-        <w:ind w:right="440" w:firstLine="360"/>
-        <w:jc w:val="right"/>
-        <w:rPr>
-          <w:rFonts w:ascii="Faruma" w:hAnsi="Faruma" w:cs="Faruma"/>
-          <w:b/>
-          <w:bCs/>
+        <w:t xml:space="preserve"> </w:t>
+      </w:r>
+      <w:r>
+        <w:rPr>
+          <w:rFonts w:ascii="Faruma" w:hAnsi="Faruma" w:cs="Faruma" w:hint="cs"/>
+          <w:b/>
+          <w:bCs/>
+          <w:color w:val="EE0000"/>
           <w:u w:val="single"/>
           <w:rtl/>
-        </w:rPr>
-      </w:pPr>
-      <w:r>
-        <w:rPr>
-          <w:rFonts w:ascii="Faruma" w:hAnsi="Faruma" w:cs="Faruma"/>
+          <w:lang w:bidi="dv-MV"/>
+        </w:rPr>
+        <w:t>ވަންޑިޕޮސިޓް</w:t>
+      </w:r>
+      <w:r>
+        <w:rPr>
+          <w:rFonts w:ascii="Faruma" w:hAnsi="Faruma" w:cs="Faruma" w:hint="cs"/>
           <w:b/>
           <w:bCs/>
           <w:u w:val="single"/>
           <w:rtl/>
         </w:rPr>
+        <w:t xml:space="preserve"> </w:t>
+      </w:r>
+      <w:r>
+        <w:rPr>
+          <w:rFonts w:ascii="Faruma" w:hAnsi="Faruma" w:cs="Faruma" w:hint="cs"/>
+          <w:b/>
+          <w:bCs/>
+          <w:color w:val="2E74B5" w:themeColor="accent1" w:themeShade="BF"/>
+          <w:u w:val="single"/>
+          <w:rtl/>
+        </w:rPr>
+        <w:t>ވަނީ ލިބިފައެވެ.</w:t>
+      </w:r>
+    </w:p>
+    <w:p>
+      <w:pPr>
+        <w:rPr>
+          <w:rFonts w:ascii="Faruma" w:hAnsi="Faruma" w:cs="Faruma"/>
+          <w:rtl/>
+        </w:rPr>
+      </w:pPr>
+    </w:p>
+    <w:p>
+      <w:pPr>
+        <w:pStyle w:val="ListParagraph"/>
+        <w:spacing w:after="0"/>
+        <w:ind w:right="440" w:firstLine="360"/>
+        <w:jc w:val="right"/>
+        <w:rPr>
+          <w:rFonts w:ascii="Faruma" w:hAnsi="Faruma" w:cs="Faruma"/>
+          <w:b/>
+          <w:bCs/>
+          <w:u w:val="single"/>
+          <w:rtl/>
+        </w:rPr>
+      </w:pPr>
+      <w:r>
+        <w:rPr>
+          <w:rFonts w:ascii="Faruma" w:hAnsi="Faruma" w:cs="Faruma"/>
+          <w:b/>
+          <w:bCs/>
+          <w:u w:val="single"/>
+          <w:rtl/>
+        </w:rPr>
         <w:t>ވެރިފަރާތް</w:t>
       </w:r>
       <w:r>
@@ -2796,6 +3015,7 @@
         <w:rPr>
           <w:rFonts w:ascii="Faruma" w:hAnsi="Faruma" w:cs="Faruma"/>
           <w:rtl/>
+          <w:lang w:bidi="dv-MV"/>
         </w:rPr>
       </w:pPr>
       <w:r>
@@ -2854,16 +3074,11 @@
       <w:r>
         <w:rPr>
           <w:rFonts w:ascii="Faruma" w:hAnsi="Faruma" w:cs="Faruma" w:hint="cs"/>
-          <w:rtl/>
-        </w:rPr>
-        <w:t>ފާޠިމަތު ޢަޛް</w:t>
-      </w:r>
-      <w:r>
-        <w:rPr>
-          <w:rFonts w:ascii="Faruma" w:hAnsi="Faruma" w:cs="Faruma" w:hint="cs"/>
-          <w:rtl/>
-        </w:rPr>
-        <w:t>ރާ</w:t>
+          <w:color w:val="EE0000"/>
+          <w:rtl/>
+          <w:lang w:bidi="dv-MV"/>
+        </w:rPr>
+        <w:t>ސައިންޓެނަންޓްނަން</w:t>
       </w:r>
     </w:p>
     <w:p>
@@ -2935,9 +3150,11 @@
       <w:r>
         <w:rPr>
           <w:rFonts w:ascii="Faruma" w:hAnsi="Faruma" w:cs="Faruma" w:hint="cs"/>
-          <w:rtl/>
-        </w:rPr>
-        <w:t>އަޒުހަރީ، ރ. އަލިފުށި</w:t>
+          <w:color w:val="EE0000"/>
+          <w:rtl/>
+          <w:lang w:bidi="dv-MV"/>
+        </w:rPr>
+        <w:t>ސައިންޓެނަންޓްއެޑްރެސް</w:t>
       </w:r>
       <w:r>
         <w:rPr>
@@ -2964,6 +3181,7 @@
         <w:jc w:val="right"/>
         <w:rPr>
           <w:rFonts w:ascii="Faruma" w:hAnsi="Faruma" w:cs="Faruma"/>
+          <w:lang w:bidi="dv-MV"/>
         </w:rPr>
       </w:pPr>
       <w:r>
@@ -3017,20 +3235,22 @@
       <w:r>
         <w:rPr>
           <w:rFonts w:ascii="Faruma" w:hAnsi="Faruma" w:cs="Faruma" w:hint="cs"/>
-          <w:rtl/>
-        </w:rPr>
-        <w:t>އޭ147511</w:t>
-      </w:r>
-    </w:p>
-    <w:p>
-      <w:pPr>
-        <w:pStyle w:val="ListParagraph"/>
-        <w:spacing w:after="0"/>
-        <w:ind w:right="440" w:firstLine="360"/>
-        <w:jc w:val="right"/>
-        <w:rPr>
-          <w:rFonts w:ascii="Faruma" w:hAnsi="Faruma" w:cs="Faruma"/>
-          <w:rtl/>
+          <w:color w:val="EE0000"/>
+          <w:rtl/>
+          <w:lang w:bidi="dv-MV"/>
+        </w:rPr>
+        <w:t>ސައިންޓެނަންޓްއައިޑީ</w:t>
+      </w:r>
+    </w:p>
+    <w:p>
+      <w:pPr>
+        <w:pStyle w:val="ListParagraph"/>
+        <w:spacing w:after="0"/>
+        <w:ind w:right="440" w:firstLine="360"/>
+        <w:jc w:val="right"/>
+        <w:rPr>
+          <w:rFonts w:ascii="Faruma" w:hAnsi="Faruma" w:cs="Faruma"/>
+          <w:lang w:bidi="dv-MV"/>
         </w:rPr>
       </w:pPr>
       <w:r>
@@ -3082,6 +3302,17 @@
           <w:rtl/>
         </w:rPr>
         <w:t xml:space="preserve"> </w:t>
+      </w:r>
+      <w:r>
+        <w:rPr>
+          <w:rFonts w:ascii="Faruma" w:hAnsi="Faruma" w:cs="Faruma" w:hint="cs"/>
+          <w:b/>
+          <w:bCs/>
+          <w:color w:val="EE0000"/>
+          <w:rtl/>
+          <w:lang w:bidi="dv-MV"/>
+        </w:rPr>
+        <w:t>ޓެނަންޓްފޯނުނަންބަރު</w:t>
       </w:r>
     </w:p>
     <w:p>

</xml_diff>